<commit_message>
chore: stop tracking environment targets, add .env.example templates
</commit_message>
<xml_diff>
--- a/docs/deployment.docx
+++ b/docs/deployment.docx
@@ -955,7 +955,7 @@
           </w:pPr>
           <w:hyperlink w:history="1" w:anchor="_Toc22">
             <w:r>
-              <w:t xml:space="preserve">5.2 Buat .env</w:t>
+              <w:t xml:space="preserve">5.2 Buat .env dan file environment</w:t>
             </w:r>
             <w:r>
               <w:tab/>
@@ -7030,7 +7030,88 @@
                 <w:sz w:val="18"/>
                 <w:szCs w:val="18"/>
               </w:rPr>
-              <w:t xml:space="preserve">Target cluster, namespace, nama release, registry/path Nexus, dan nama image per environment. Di-commit, tanpa rahasia.</w:t>
+              <w:t xml:space="preserve">Target cluster, namespace, nama release, registry/path Nexus, dan nama image per environment. Lokal saja (di-ignore git), tanpa rahasia.</w:t>
+            </w:r>
+          </w:p>
+        </w:tc>
+      </w:tr>
+      <w:tr>
+        <w:trPr>
+          <w:cantSplit/>
+        </w:trPr>
+        <w:tc>
+          <w:tcPr>
+            <w:tcW w:type="dxa" w:w="2700"/>
+            <w:tcBorders>
+              <w:top w:val="single" w:color="D1D5DB" w:sz="4"/>
+              <w:left w:val="single" w:color="D1D5DB" w:sz="4"/>
+              <w:bottom w:val="single" w:color="D1D5DB" w:sz="4"/>
+              <w:right w:val="single" w:color="D1D5DB" w:sz="4"/>
+            </w:tcBorders>
+            <w:tcMar>
+              <w:top w:type="dxa" w:w="70"/>
+              <w:left w:type="dxa" w:w="110"/>
+              <w:bottom w:type="dxa" w:w="70"/>
+              <w:right w:type="dxa" w:w="110"/>
+            </w:tcMar>
+          </w:tcPr>
+          <w:p>
+            <w:pPr>
+              <w:spacing w:after="40" w:line="252"/>
+            </w:pPr>
+            <w:r>
+              <w:rPr>
+                <w:rFonts w:ascii="Menlo" w:cs="Menlo" w:eastAsia="Menlo" w:hAnsi="Menlo"/>
+                <w:color w:val="8A1538"/>
+                <w:sz w:val="15"/>
+                <w:szCs w:val="15"/>
+              </w:rPr>
+              <w:t xml:space="preserve">environments/&lt;env&gt;.env.example</w:t>
+            </w:r>
+          </w:p>
+        </w:tc>
+        <w:tc>
+          <w:tcPr>
+            <w:tcW w:type="dxa" w:w="6938"/>
+            <w:tcBorders>
+              <w:top w:val="single" w:color="D1D5DB" w:sz="4"/>
+              <w:left w:val="single" w:color="D1D5DB" w:sz="4"/>
+              <w:bottom w:val="single" w:color="D1D5DB" w:sz="4"/>
+              <w:right w:val="single" w:color="D1D5DB" w:sz="4"/>
+            </w:tcBorders>
+            <w:tcMar>
+              <w:top w:type="dxa" w:w="70"/>
+              <w:left w:type="dxa" w:w="110"/>
+              <w:bottom w:type="dxa" w:w="70"/>
+              <w:right w:type="dxa" w:w="110"/>
+            </w:tcMar>
+          </w:tcPr>
+          <w:p>
+            <w:pPr>
+              <w:spacing w:after="40" w:line="252"/>
+            </w:pPr>
+            <w:r>
+              <w:rPr>
+                <w:sz w:val="18"/>
+                <w:szCs w:val="18"/>
+              </w:rPr>
+              <w:t xml:space="preserve">Template file di atas dengan placeholder </w:t>
+            </w:r>
+            <w:r>
+              <w:rPr>
+                <w:rFonts w:ascii="Menlo" w:cs="Menlo" w:eastAsia="Menlo" w:hAnsi="Menlo"/>
+                <w:color w:val="8A1538"/>
+                <w:sz w:val="15"/>
+                <w:szCs w:val="15"/>
+              </w:rPr>
+              <w:t xml:space="preserve">&lt;...&gt;</w:t>
+            </w:r>
+            <w:r>
+              <w:rPr>
+                <w:sz w:val="18"/>
+                <w:szCs w:val="18"/>
+              </w:rPr>
+              <w:t xml:space="preserve">. Di-commit.</w:t>
             </w:r>
           </w:p>
         </w:tc>
@@ -9413,9 +9494,50 @@
       </w:pPr>
       <w:bookmarkStart w:name="_Toc22" w:id="22"/>
       <w:r>
-        <w:t xml:space="preserve">5.2 Buat .env</w:t>
+        <w:t xml:space="preserve">5.2 Buat .env dan file environment</w:t>
       </w:r>
       <w:bookmarkEnd w:id="22"/>
+    </w:p>
+    <w:p>
+      <w:pPr>
+        <w:spacing w:after="140" w:line="288"/>
+      </w:pPr>
+      <w:r>
+        <w:rPr>
+          <w:rFonts w:ascii="Menlo" w:cs="Menlo" w:eastAsia="Menlo" w:hAnsi="Menlo"/>
+          <w:color w:val="8A1538"/>
+          <w:sz w:val="18"/>
+          <w:szCs w:val="18"/>
+        </w:rPr>
+        <w:t xml:space="preserve">.env</w:t>
+      </w:r>
+      <w:r>
+        <w:t xml:space="preserve"> dan </w:t>
+      </w:r>
+      <w:r>
+        <w:rPr>
+          <w:rFonts w:ascii="Menlo" w:cs="Menlo" w:eastAsia="Menlo" w:hAnsi="Menlo"/>
+          <w:color w:val="8A1538"/>
+          <w:sz w:val="18"/>
+          <w:szCs w:val="18"/>
+        </w:rPr>
+        <w:t xml:space="preserve">environments/&lt;env&gt;.env</w:t>
+      </w:r>
+      <w:r>
+        <w:t xml:space="preserve"> di-ignore git. Yang ada di repo hanya template </w:t>
+      </w:r>
+      <w:r>
+        <w:rPr>
+          <w:rFonts w:ascii="Menlo" w:cs="Menlo" w:eastAsia="Menlo" w:hAnsi="Menlo"/>
+          <w:color w:val="8A1538"/>
+          <w:sz w:val="18"/>
+          <w:szCs w:val="18"/>
+        </w:rPr>
+        <w:t xml:space="preserve">*.example</w:t>
+      </w:r>
+      <w:r>
+        <w:t xml:space="preserve">; nilainya minta ke tim infra atau rekan yang sudah punya, lalu kirim lewat kanal aman, bukan lewat git.</w:t>
+      </w:r>
     </w:p>
     <w:p>
       <w:pPr>
@@ -9453,6 +9575,48 @@
     </w:p>
     <w:p>
       <w:pPr>
+        <w:keepNext/>
+        <w:keepLines/>
+        <w:pBdr>
+          <w:left w:val="single" w:color="9CA3AF" w:sz="18" w:space="8"/>
+        </w:pBdr>
+        <w:shd w:fill="F3F4F6" w:color="auto" w:val="clear"/>
+        <w:spacing w:after="0" w:before="0" w:line="252"/>
+        <w:ind w:left="700"/>
+      </w:pPr>
+      <w:r>
+        <w:rPr>
+          <w:rFonts w:ascii="Menlo" w:cs="Menlo" w:eastAsia="Menlo" w:hAnsi="Menlo"/>
+          <w:color w:val="111827"/>
+          <w:sz w:val="17"/>
+          <w:szCs w:val="17"/>
+        </w:rPr>
+        <w:t xml:space="preserve">cp environments/dev.env.example environments/dev.env</w:t>
+      </w:r>
+    </w:p>
+    <w:p>
+      <w:pPr>
+        <w:keepNext/>
+        <w:keepLines/>
+        <w:pBdr>
+          <w:left w:val="single" w:color="9CA3AF" w:sz="18" w:space="8"/>
+        </w:pBdr>
+        <w:shd w:fill="F3F4F6" w:color="auto" w:val="clear"/>
+        <w:spacing w:after="0" w:before="0" w:line="252"/>
+        <w:ind w:left="700"/>
+      </w:pPr>
+      <w:r>
+        <w:rPr>
+          <w:rFonts w:ascii="Menlo" w:cs="Menlo" w:eastAsia="Menlo" w:hAnsi="Menlo"/>
+          <w:color w:val="111827"/>
+          <w:sz w:val="17"/>
+          <w:szCs w:val="17"/>
+        </w:rPr>
+        <w:t xml:space="preserve">cp environments/shared.env.example environments/shared.env</w:t>
+      </w:r>
+    </w:p>
+    <w:p>
+      <w:pPr>
         <w:keepNext w:val="false"/>
         <w:keepLines/>
         <w:pBdr>
@@ -9469,7 +9633,7 @@
           <w:sz w:val="17"/>
           <w:szCs w:val="17"/>
         </w:rPr>
-        <w:t xml:space="preserve">chmod 600 .env</w:t>
+        <w:t xml:space="preserve">chmod 600 .env environments/*.env</w:t>
       </w:r>
     </w:p>
     <w:p>
@@ -9482,7 +9646,19 @@
         <w:spacing w:after="80" w:line="276"/>
       </w:pPr>
       <w:r>
-        <w:t xml:space="preserve">Isi </w:t>
+        <w:t xml:space="preserve">Di </w:t>
+      </w:r>
+      <w:r>
+        <w:rPr>
+          <w:rFonts w:ascii="Menlo" w:cs="Menlo" w:eastAsia="Menlo" w:hAnsi="Menlo"/>
+          <w:color w:val="8A1538"/>
+          <w:sz w:val="18"/>
+          <w:szCs w:val="18"/>
+        </w:rPr>
+        <w:t xml:space="preserve">.env</w:t>
+      </w:r>
+      <w:r>
+        <w:t xml:space="preserve">, isi </w:t>
       </w:r>
       <w:r>
         <w:rPr>
@@ -9543,7 +9719,116 @@
         <w:spacing w:after="80" w:line="276"/>
       </w:pPr>
       <w:r>
-        <w:t xml:space="preserve">Jangan letakkan rahasia di </w:t>
+        <w:t xml:space="preserve">Di </w:t>
+      </w:r>
+      <w:r>
+        <w:rPr>
+          <w:rFonts w:ascii="Menlo" w:cs="Menlo" w:eastAsia="Menlo" w:hAnsi="Menlo"/>
+          <w:color w:val="8A1538"/>
+          <w:sz w:val="18"/>
+          <w:szCs w:val="18"/>
+        </w:rPr>
+        <w:t xml:space="preserve">environments/&lt;env&gt;.env</w:t>
+      </w:r>
+      <w:r>
+        <w:t xml:space="preserve">, ganti setiap </w:t>
+      </w:r>
+      <w:r>
+        <w:rPr>
+          <w:rFonts w:ascii="Menlo" w:cs="Menlo" w:eastAsia="Menlo" w:hAnsi="Menlo"/>
+          <w:color w:val="8A1538"/>
+          <w:sz w:val="18"/>
+          <w:szCs w:val="18"/>
+        </w:rPr>
+        <w:t xml:space="preserve">&lt;...&gt;</w:t>
+      </w:r>
+      <w:r>
+        <w:t xml:space="preserve">: </w:t>
+      </w:r>
+      <w:r>
+        <w:rPr>
+          <w:rFonts w:ascii="Menlo" w:cs="Menlo" w:eastAsia="Menlo" w:hAnsi="Menlo"/>
+          <w:color w:val="8A1538"/>
+          <w:sz w:val="18"/>
+          <w:szCs w:val="18"/>
+        </w:rPr>
+        <w:t xml:space="preserve">GKE_PROJECT</w:t>
+      </w:r>
+      <w:r>
+        <w:t xml:space="preserve">, </w:t>
+      </w:r>
+      <w:r>
+        <w:rPr>
+          <w:rFonts w:ascii="Menlo" w:cs="Menlo" w:eastAsia="Menlo" w:hAnsi="Menlo"/>
+          <w:color w:val="8A1538"/>
+          <w:sz w:val="18"/>
+          <w:szCs w:val="18"/>
+        </w:rPr>
+        <w:t xml:space="preserve">GKE_CLUSTER</w:t>
+      </w:r>
+      <w:r>
+        <w:t xml:space="preserve">, </w:t>
+      </w:r>
+      <w:r>
+        <w:rPr>
+          <w:rFonts w:ascii="Menlo" w:cs="Menlo" w:eastAsia="Menlo" w:hAnsi="Menlo"/>
+          <w:color w:val="8A1538"/>
+          <w:sz w:val="18"/>
+          <w:szCs w:val="18"/>
+        </w:rPr>
+        <w:t xml:space="preserve">NEXUS_REGISTRY</w:t>
+      </w:r>
+      <w:r>
+        <w:t xml:space="preserve">, dan untuk </w:t>
+      </w:r>
+      <w:r>
+        <w:rPr>
+          <w:rFonts w:ascii="Menlo" w:cs="Menlo" w:eastAsia="Menlo" w:hAnsi="Menlo"/>
+          <w:color w:val="8A1538"/>
+          <w:sz w:val="18"/>
+          <w:szCs w:val="18"/>
+        </w:rPr>
+        <w:t xml:space="preserve">shared</w:t>
+      </w:r>
+      <w:r>
+        <w:t xml:space="preserve"> juga </w:t>
+      </w:r>
+      <w:r>
+        <w:rPr>
+          <w:rFonts w:ascii="Menlo" w:cs="Menlo" w:eastAsia="Menlo" w:hAnsi="Menlo"/>
+          <w:color w:val="8A1538"/>
+          <w:sz w:val="18"/>
+          <w:szCs w:val="18"/>
+        </w:rPr>
+        <w:t xml:space="preserve">GKE_BASTION</w:t>
+      </w:r>
+      <w:r>
+        <w:t xml:space="preserve">. Nilai lain (release, namespace, image) sudah berisi default.</w:t>
+      </w:r>
+    </w:p>
+    <w:p>
+      <w:pPr>
+        <w:pStyle w:val="ListParagraph"/>
+        <w:numPr>
+          <w:ilvl w:val="0"/>
+          <w:numId w:val="5"/>
+        </w:numPr>
+        <w:spacing w:after="80" w:line="276"/>
+      </w:pPr>
+      <w:r>
+        <w:t xml:space="preserve">Rahasia (password, token) hanya di </w:t>
+      </w:r>
+      <w:r>
+        <w:rPr>
+          <w:rFonts w:ascii="Menlo" w:cs="Menlo" w:eastAsia="Menlo" w:hAnsi="Menlo"/>
+          <w:color w:val="8A1538"/>
+          <w:sz w:val="18"/>
+          <w:szCs w:val="18"/>
+        </w:rPr>
+        <w:t xml:space="preserve">.env</w:t>
+      </w:r>
+      <w:r>
+        <w:t xml:space="preserve">. Jangan taruh di </w:t>
       </w:r>
       <w:r>
         <w:rPr>
@@ -9555,7 +9840,7 @@
         <w:t xml:space="preserve">environments/*.env</w:t>
       </w:r>
       <w:r>
-        <w:t xml:space="preserve"> atau file values Helm; keduanya di-commit.</w:t>
+        <w:t xml:space="preserve"> atau file values Helm.</w:t>
       </w:r>
     </w:p>
     <w:p>
@@ -13441,7 +13726,28 @@
           <w:sz w:val="17"/>
           <w:szCs w:val="17"/>
         </w:rPr>
-        <w:t xml:space="preserve">cp environments/dev.env environments/prd.env</w:t>
+        <w:t xml:space="preserve">cp environments/dev.env.example environments/prd.env.example   # template, di-commit</w:t>
+      </w:r>
+    </w:p>
+    <w:p>
+      <w:pPr>
+        <w:keepNext/>
+        <w:keepLines/>
+        <w:pBdr>
+          <w:left w:val="single" w:color="9CA3AF" w:sz="18" w:space="8"/>
+        </w:pBdr>
+        <w:shd w:fill="F3F4F6" w:color="auto" w:val="clear"/>
+        <w:spacing w:after="0" w:before="0" w:line="252"/>
+        <w:ind w:left="700"/>
+      </w:pPr>
+      <w:r>
+        <w:rPr>
+          <w:rFonts w:ascii="Menlo" w:cs="Menlo" w:eastAsia="Menlo" w:hAnsi="Menlo"/>
+          <w:color w:val="111827"/>
+          <w:sz w:val="17"/>
+          <w:szCs w:val="17"/>
+        </w:rPr>
+        <w:t xml:space="preserve">cp environments/prd.env.example environments/prd.env           # lokal, di-ignore</w:t>
       </w:r>
     </w:p>
     <w:p>
@@ -14713,7 +15019,7 @@
                 <w:sz w:val="18"/>
                 <w:szCs w:val="18"/>
               </w:rPr>
-              <w:t xml:space="preserve"> tidak ditemukan.</w:t>
+              <w:t xml:space="preserve"> tidak ada (file ini di-ignore git, jadi tidak ikut saat clone).</w:t>
             </w:r>
           </w:p>
         </w:tc>
@@ -14742,7 +15048,7 @@
                 <w:sz w:val="18"/>
                 <w:szCs w:val="18"/>
               </w:rPr>
-              <w:t xml:space="preserve">Periksa ejaan </w:t>
+              <w:t xml:space="preserve">Salin dari </w:t>
             </w:r>
             <w:r>
               <w:rPr>
@@ -14751,6 +15057,22 @@
                 <w:sz w:val="15"/>
                 <w:szCs w:val="15"/>
               </w:rPr>
+              <w:t xml:space="preserve">environments/&lt;env&gt;.env.example</w:t>
+            </w:r>
+            <w:r>
+              <w:rPr>
+                <w:sz w:val="18"/>
+                <w:szCs w:val="18"/>
+              </w:rPr>
+              <w:t xml:space="preserve"> dan isi (Bagian 5.2), atau periksa ejaan </w:t>
+            </w:r>
+            <w:r>
+              <w:rPr>
+                <w:rFonts w:ascii="Menlo" w:cs="Menlo" w:eastAsia="Menlo" w:hAnsi="Menlo"/>
+                <w:color w:val="8A1538"/>
+                <w:sz w:val="15"/>
+                <w:szCs w:val="15"/>
+              </w:rPr>
               <w:t xml:space="preserve">--env</w:t>
             </w:r>
             <w:r>
@@ -14758,7 +15080,7 @@
                 <w:sz w:val="18"/>
                 <w:szCs w:val="18"/>
               </w:rPr>
-              <w:t xml:space="preserve"> atau buat environment (Bab 11).</w:t>
+              <w:t xml:space="preserve">.</w:t>
             </w:r>
           </w:p>
         </w:tc>
@@ -16675,6 +16997,40 @@
       </w:r>
       <w:r>
         <w:t xml:space="preserve"> atau values Helm.</w:t>
+      </w:r>
+    </w:p>
+    <w:p>
+      <w:pPr>
+        <w:pStyle w:val="ListParagraph"/>
+        <w:numPr>
+          <w:ilvl w:val="0"/>
+          <w:numId w:val="3"/>
+        </w:numPr>
+        <w:spacing w:after="80" w:line="276"/>
+      </w:pPr>
+      <w:r>
+        <w:rPr>
+          <w:rFonts w:ascii="Menlo" w:cs="Menlo" w:eastAsia="Menlo" w:hAnsi="Menlo"/>
+          <w:color w:val="8A1538"/>
+          <w:sz w:val="18"/>
+          <w:szCs w:val="18"/>
+        </w:rPr>
+        <w:t xml:space="preserve">environments/&lt;env&gt;.env</w:t>
+      </w:r>
+      <w:r>
+        <w:t xml:space="preserve"> (project, cluster, bastion, host Nexus) juga di-ignore; yang di-commit hanya template </w:t>
+      </w:r>
+      <w:r>
+        <w:rPr>
+          <w:rFonts w:ascii="Menlo" w:cs="Menlo" w:eastAsia="Menlo" w:hAnsi="Menlo"/>
+          <w:color w:val="8A1538"/>
+          <w:sz w:val="18"/>
+          <w:szCs w:val="18"/>
+        </w:rPr>
+        <w:t xml:space="preserve">.env.example</w:t>
+      </w:r>
+      <w:r>
+        <w:t xml:space="preserve"> dengan placeholder.</w:t>
       </w:r>
     </w:p>
     <w:p>

</xml_diff>

<commit_message>
feat: name objects after Bitbucket repos, admin UI image mf-bribrain-nilam-ocr-admin-ui
- fullnameOverride: ms-bribrain-nilam-ocr-orchestrator (backend), mf-bribrain-nilam-ocr-admin-ui (admin UI)
- rbac-ui nginx and APM service names follow the new backend name
- RBAC_UI_IMAGE in env templates points at mf-bribrain-nilam-ocr-admin-ui
- README and deployment guide: naming convention, migration notes
</commit_message>
<xml_diff>
--- a/docs/deployment.docx
+++ b/docs/deployment.docx
@@ -902,37 +902,37 @@
         </w:p>
         <w:p>
           <w:pPr>
-            <w:pStyle w:val="TOC1"/>
-            <w:tabs>
-              <w:tab w:val="right" w:pos="9638" w:leader="dot"/>
-            </w:tabs>
-          </w:pPr>
-          <w:hyperlink w:history="1" w:anchor="_Toc20">
-            <w:r>
-              <w:t xml:space="preserve">5. Menyiapkan deploy host</w:t>
-            </w:r>
-            <w:r>
-              <w:tab/>
-            </w:r>
-            <w:r>
-              <w:fldChar w:fldCharType="begin" w:dirty="true"/>
-              <w:instrText xml:space="preserve">PAGEREF _Toc20 \h</w:instrText>
-              <w:fldChar w:fldCharType="separate"/>
-              <w:fldChar w:fldCharType="end"/>
-            </w:r>
-          </w:hyperlink>
-        </w:p>
-        <w:p>
-          <w:pPr>
             <w:pStyle w:val="TOC2"/>
             <w:tabs>
               <w:tab w:val="right" w:pos="9638" w:leader="dot"/>
             </w:tabs>
             <w:ind w:left="220"/>
           </w:pPr>
+          <w:hyperlink w:history="1" w:anchor="_Toc20">
+            <w:r>
+              <w:t xml:space="preserve">4.5 Konvensi penamaan</w:t>
+            </w:r>
+            <w:r>
+              <w:tab/>
+            </w:r>
+            <w:r>
+              <w:fldChar w:fldCharType="begin" w:dirty="true"/>
+              <w:instrText xml:space="preserve">PAGEREF _Toc20 \h</w:instrText>
+              <w:fldChar w:fldCharType="separate"/>
+              <w:fldChar w:fldCharType="end"/>
+            </w:r>
+          </w:hyperlink>
+        </w:p>
+        <w:p>
+          <w:pPr>
+            <w:pStyle w:val="TOC1"/>
+            <w:tabs>
+              <w:tab w:val="right" w:pos="9638" w:leader="dot"/>
+            </w:tabs>
+          </w:pPr>
           <w:hyperlink w:history="1" w:anchor="_Toc21">
             <w:r>
-              <w:t xml:space="preserve">5.1 Salin repo</w:t>
+              <w:t xml:space="preserve">5. Menyiapkan deploy host</w:t>
             </w:r>
             <w:r>
               <w:tab/>
@@ -955,7 +955,7 @@
           </w:pPr>
           <w:hyperlink w:history="1" w:anchor="_Toc22">
             <w:r>
-              <w:t xml:space="preserve">5.2 Buat .env dan file environment</w:t>
+              <w:t xml:space="preserve">5.1 Salin repo</w:t>
             </w:r>
             <w:r>
               <w:tab/>
@@ -978,7 +978,7 @@
           </w:pPr>
           <w:hyperlink w:history="1" w:anchor="_Toc23">
             <w:r>
-              <w:t xml:space="preserve">5.3 Login</w:t>
+              <w:t xml:space="preserve">5.2 Buat .env dan file environment</w:t>
             </w:r>
             <w:r>
               <w:tab/>
@@ -986,28 +986,6 @@
             <w:r>
               <w:fldChar w:fldCharType="begin" w:dirty="true"/>
               <w:instrText xml:space="preserve">PAGEREF _Toc23 \h</w:instrText>
-              <w:fldChar w:fldCharType="separate"/>
-              <w:fldChar w:fldCharType="end"/>
-            </w:r>
-          </w:hyperlink>
-        </w:p>
-        <w:p>
-          <w:pPr>
-            <w:pStyle w:val="TOC1"/>
-            <w:tabs>
-              <w:tab w:val="right" w:pos="9638" w:leader="dot"/>
-            </w:tabs>
-          </w:pPr>
-          <w:hyperlink w:history="1" w:anchor="_Toc24">
-            <w:r>
-              <w:t xml:space="preserve">6. Persiapan sekali di awal</w:t>
-            </w:r>
-            <w:r>
-              <w:tab/>
-            </w:r>
-            <w:r>
-              <w:fldChar w:fldCharType="begin" w:dirty="true"/>
-              <w:instrText xml:space="preserve">PAGEREF _Toc24 \h</w:instrText>
               <w:fldChar w:fldCharType="separate"/>
               <w:fldChar w:fldCharType="end"/>
             </w:r>
@@ -1021,9 +999,31 @@
             </w:tabs>
             <w:ind w:left="220"/>
           </w:pPr>
+          <w:hyperlink w:history="1" w:anchor="_Toc24">
+            <w:r>
+              <w:t xml:space="preserve">5.3 Login</w:t>
+            </w:r>
+            <w:r>
+              <w:tab/>
+            </w:r>
+            <w:r>
+              <w:fldChar w:fldCharType="begin" w:dirty="true"/>
+              <w:instrText xml:space="preserve">PAGEREF _Toc24 \h</w:instrText>
+              <w:fldChar w:fldCharType="separate"/>
+              <w:fldChar w:fldCharType="end"/>
+            </w:r>
+          </w:hyperlink>
+        </w:p>
+        <w:p>
+          <w:pPr>
+            <w:pStyle w:val="TOC1"/>
+            <w:tabs>
+              <w:tab w:val="right" w:pos="9638" w:leader="dot"/>
+            </w:tabs>
+          </w:pPr>
           <w:hyperlink w:history="1" w:anchor="_Toc25">
             <w:r>
-              <w:t xml:space="preserve">6.1 Secret pull Nexus</w:t>
+              <w:t xml:space="preserve">6. Persiapan sekali di awal</w:t>
             </w:r>
             <w:r>
               <w:tab/>
@@ -1046,7 +1046,7 @@
           </w:pPr>
           <w:hyperlink w:history="1" w:anchor="_Toc26">
             <w:r>
-              <w:t xml:space="preserve">6.2 Secret aplikasi ocr-orchestration</w:t>
+              <w:t xml:space="preserve">6.1 Secret pull Nexus</w:t>
             </w:r>
             <w:r>
               <w:tab/>
@@ -1069,7 +1069,7 @@
           </w:pPr>
           <w:hyperlink w:history="1" w:anchor="_Toc27">
             <w:r>
-              <w:t xml:space="preserve">6.3 Setup pertama di cluster shared</w:t>
+              <w:t xml:space="preserve">6.2 Secret aplikasi ocr-orchestration</w:t>
             </w:r>
             <w:r>
               <w:tab/>
@@ -1092,7 +1092,7 @@
           </w:pPr>
           <w:hyperlink w:history="1" w:anchor="_Toc28">
             <w:r>
-              <w:t xml:space="preserve">6.4 Superadmin pertama</w:t>
+              <w:t xml:space="preserve">6.3 Setup pertama di cluster shared</w:t>
             </w:r>
             <w:r>
               <w:tab/>
@@ -1115,7 +1115,7 @@
           </w:pPr>
           <w:hyperlink w:history="1" w:anchor="_Toc29">
             <w:r>
-              <w:t xml:space="preserve">6.5 Uji koneksi Bedrock (shared)</w:t>
+              <w:t xml:space="preserve">6.4 Superadmin pertama</w:t>
             </w:r>
             <w:r>
               <w:tab/>
@@ -1123,28 +1123,6 @@
             <w:r>
               <w:fldChar w:fldCharType="begin" w:dirty="true"/>
               <w:instrText xml:space="preserve">PAGEREF _Toc29 \h</w:instrText>
-              <w:fldChar w:fldCharType="separate"/>
-              <w:fldChar w:fldCharType="end"/>
-            </w:r>
-          </w:hyperlink>
-        </w:p>
-        <w:p>
-          <w:pPr>
-            <w:pStyle w:val="TOC1"/>
-            <w:tabs>
-              <w:tab w:val="right" w:pos="9638" w:leader="dot"/>
-            </w:tabs>
-          </w:pPr>
-          <w:hyperlink w:history="1" w:anchor="_Toc30">
-            <w:r>
-              <w:t xml:space="preserve">7. Deploy rutin</w:t>
-            </w:r>
-            <w:r>
-              <w:tab/>
-            </w:r>
-            <w:r>
-              <w:fldChar w:fldCharType="begin" w:dirty="true"/>
-              <w:instrText xml:space="preserve">PAGEREF _Toc30 \h</w:instrText>
               <w:fldChar w:fldCharType="separate"/>
               <w:fldChar w:fldCharType="end"/>
             </w:r>
@@ -1158,9 +1136,31 @@
             </w:tabs>
             <w:ind w:left="220"/>
           </w:pPr>
+          <w:hyperlink w:history="1" w:anchor="_Toc30">
+            <w:r>
+              <w:t xml:space="preserve">6.5 Uji koneksi Bedrock (shared)</w:t>
+            </w:r>
+            <w:r>
+              <w:tab/>
+            </w:r>
+            <w:r>
+              <w:fldChar w:fldCharType="begin" w:dirty="true"/>
+              <w:instrText xml:space="preserve">PAGEREF _Toc30 \h</w:instrText>
+              <w:fldChar w:fldCharType="separate"/>
+              <w:fldChar w:fldCharType="end"/>
+            </w:r>
+          </w:hyperlink>
+        </w:p>
+        <w:p>
+          <w:pPr>
+            <w:pStyle w:val="TOC1"/>
+            <w:tabs>
+              <w:tab w:val="right" w:pos="9638" w:leader="dot"/>
+            </w:tabs>
+          </w:pPr>
           <w:hyperlink w:history="1" w:anchor="_Toc31">
             <w:r>
-              <w:t xml:space="preserve">7.1 Checklist sebelum deploy</w:t>
+              <w:t xml:space="preserve">7. Deploy rutin</w:t>
             </w:r>
             <w:r>
               <w:tab/>
@@ -1183,7 +1183,7 @@
           </w:pPr>
           <w:hyperlink w:history="1" w:anchor="_Toc32">
             <w:r>
-              <w:t xml:space="preserve">7.2 Perintah deploy</w:t>
+              <w:t xml:space="preserve">7.1 Checklist sebelum deploy</w:t>
             </w:r>
             <w:r>
               <w:tab/>
@@ -1206,7 +1206,7 @@
           </w:pPr>
           <w:hyperlink w:history="1" w:anchor="_Toc33">
             <w:r>
-              <w:t xml:space="preserve">7.3 Yang dilakukan script</w:t>
+              <w:t xml:space="preserve">7.2 Perintah deploy</w:t>
             </w:r>
             <w:r>
               <w:tab/>
@@ -1229,7 +1229,7 @@
           </w:pPr>
           <w:hyperlink w:history="1" w:anchor="_Toc34">
             <w:r>
-              <w:t xml:space="preserve">7.4 Catatan perilaku rollout</w:t>
+              <w:t xml:space="preserve">7.3 Yang dilakukan script</w:t>
             </w:r>
             <w:r>
               <w:tab/>
@@ -1252,7 +1252,7 @@
           </w:pPr>
           <w:hyperlink w:history="1" w:anchor="_Toc35">
             <w:r>
-              <w:t xml:space="preserve">7.5 Override sekali jalan</w:t>
+              <w:t xml:space="preserve">7.4 Catatan perilaku rollout</w:t>
             </w:r>
             <w:r>
               <w:tab/>
@@ -1260,28 +1260,6 @@
             <w:r>
               <w:fldChar w:fldCharType="begin" w:dirty="true"/>
               <w:instrText xml:space="preserve">PAGEREF _Toc35 \h</w:instrText>
-              <w:fldChar w:fldCharType="separate"/>
-              <w:fldChar w:fldCharType="end"/>
-            </w:r>
-          </w:hyperlink>
-        </w:p>
-        <w:p>
-          <w:pPr>
-            <w:pStyle w:val="TOC1"/>
-            <w:tabs>
-              <w:tab w:val="right" w:pos="9638" w:leader="dot"/>
-            </w:tabs>
-          </w:pPr>
-          <w:hyperlink w:history="1" w:anchor="_Toc36">
-            <w:r>
-              <w:t xml:space="preserve">8. Verifikasi setelah deploy</w:t>
-            </w:r>
-            <w:r>
-              <w:tab/>
-            </w:r>
-            <w:r>
-              <w:fldChar w:fldCharType="begin" w:dirty="true"/>
-              <w:instrText xml:space="preserve">PAGEREF _Toc36 \h</w:instrText>
               <w:fldChar w:fldCharType="separate"/>
               <w:fldChar w:fldCharType="end"/>
             </w:r>
@@ -1295,16 +1273,16 @@
             </w:tabs>
             <w:ind w:left="220"/>
           </w:pPr>
-          <w:hyperlink w:history="1" w:anchor="_Toc37">
-            <w:r>
-              <w:t xml:space="preserve">8.1 Kriteria berhasil</w:t>
+          <w:hyperlink w:history="1" w:anchor="_Toc36">
+            <w:r>
+              <w:t xml:space="preserve">7.5 Override sekali jalan</w:t>
             </w:r>
             <w:r>
               <w:tab/>
             </w:r>
             <w:r>
               <w:fldChar w:fldCharType="begin" w:dirty="true"/>
-              <w:instrText xml:space="preserve">PAGEREF _Toc37 \h</w:instrText>
+              <w:instrText xml:space="preserve">PAGEREF _Toc36 \h</w:instrText>
               <w:fldChar w:fldCharType="separate"/>
               <w:fldChar w:fldCharType="end"/>
             </w:r>
@@ -1317,16 +1295,16 @@
               <w:tab w:val="right" w:pos="9638" w:leader="dot"/>
             </w:tabs>
           </w:pPr>
-          <w:hyperlink w:history="1" w:anchor="_Toc38">
-            <w:r>
-              <w:t xml:space="preserve">9. Rollback</w:t>
+          <w:hyperlink w:history="1" w:anchor="_Toc37">
+            <w:r>
+              <w:t xml:space="preserve">8. Verifikasi setelah deploy</w:t>
             </w:r>
             <w:r>
               <w:tab/>
             </w:r>
             <w:r>
               <w:fldChar w:fldCharType="begin" w:dirty="true"/>
-              <w:instrText xml:space="preserve">PAGEREF _Toc38 \h</w:instrText>
+              <w:instrText xml:space="preserve">PAGEREF _Toc37 \h</w:instrText>
               <w:fldChar w:fldCharType="separate"/>
               <w:fldChar w:fldCharType="end"/>
             </w:r>
@@ -1340,9 +1318,31 @@
             </w:tabs>
             <w:ind w:left="220"/>
           </w:pPr>
+          <w:hyperlink w:history="1" w:anchor="_Toc38">
+            <w:r>
+              <w:t xml:space="preserve">8.1 Kriteria berhasil</w:t>
+            </w:r>
+            <w:r>
+              <w:tab/>
+            </w:r>
+            <w:r>
+              <w:fldChar w:fldCharType="begin" w:dirty="true"/>
+              <w:instrText xml:space="preserve">PAGEREF _Toc38 \h</w:instrText>
+              <w:fldChar w:fldCharType="separate"/>
+              <w:fldChar w:fldCharType="end"/>
+            </w:r>
+          </w:hyperlink>
+        </w:p>
+        <w:p>
+          <w:pPr>
+            <w:pStyle w:val="TOC1"/>
+            <w:tabs>
+              <w:tab w:val="right" w:pos="9638" w:leader="dot"/>
+            </w:tabs>
+          </w:pPr>
           <w:hyperlink w:history="1" w:anchor="_Toc39">
             <w:r>
-              <w:t xml:space="preserve">9.1 Otomatis</w:t>
+              <w:t xml:space="preserve">9. Rollback</w:t>
             </w:r>
             <w:r>
               <w:tab/>
@@ -1365,7 +1365,7 @@
           </w:pPr>
           <w:hyperlink w:history="1" w:anchor="_Toc40">
             <w:r>
-              <w:t xml:space="preserve">9.2 Manual</w:t>
+              <w:t xml:space="preserve">9.1 Otomatis</w:t>
             </w:r>
             <w:r>
               <w:tab/>
@@ -1373,28 +1373,6 @@
             <w:r>
               <w:fldChar w:fldCharType="begin" w:dirty="true"/>
               <w:instrText xml:space="preserve">PAGEREF _Toc40 \h</w:instrText>
-              <w:fldChar w:fldCharType="separate"/>
-              <w:fldChar w:fldCharType="end"/>
-            </w:r>
-          </w:hyperlink>
-        </w:p>
-        <w:p>
-          <w:pPr>
-            <w:pStyle w:val="TOC1"/>
-            <w:tabs>
-              <w:tab w:val="right" w:pos="9638" w:leader="dot"/>
-            </w:tabs>
-          </w:pPr>
-          <w:hyperlink w:history="1" w:anchor="_Toc41">
-            <w:r>
-              <w:t xml:space="preserve">10. Operasi Redis bersama (shared)</w:t>
-            </w:r>
-            <w:r>
-              <w:tab/>
-            </w:r>
-            <w:r>
-              <w:fldChar w:fldCharType="begin" w:dirty="true"/>
-              <w:instrText xml:space="preserve">PAGEREF _Toc41 \h</w:instrText>
               <w:fldChar w:fldCharType="separate"/>
               <w:fldChar w:fldCharType="end"/>
             </w:r>
@@ -1408,9 +1386,31 @@
             </w:tabs>
             <w:ind w:left="220"/>
           </w:pPr>
+          <w:hyperlink w:history="1" w:anchor="_Toc41">
+            <w:r>
+              <w:t xml:space="preserve">9.2 Manual</w:t>
+            </w:r>
+            <w:r>
+              <w:tab/>
+            </w:r>
+            <w:r>
+              <w:fldChar w:fldCharType="begin" w:dirty="true"/>
+              <w:instrText xml:space="preserve">PAGEREF _Toc41 \h</w:instrText>
+              <w:fldChar w:fldCharType="separate"/>
+              <w:fldChar w:fldCharType="end"/>
+            </w:r>
+          </w:hyperlink>
+        </w:p>
+        <w:p>
+          <w:pPr>
+            <w:pStyle w:val="TOC1"/>
+            <w:tabs>
+              <w:tab w:val="right" w:pos="9638" w:leader="dot"/>
+            </w:tabs>
+          </w:pPr>
           <w:hyperlink w:history="1" w:anchor="_Toc42">
             <w:r>
-              <w:t xml:space="preserve">10.1 Tambah user team atau rotasi password</w:t>
+              <w:t xml:space="preserve">10. Operasi Redis bersama (shared)</w:t>
             </w:r>
             <w:r>
               <w:tab/>
@@ -1433,7 +1433,7 @@
           </w:pPr>
           <w:hyperlink w:history="1" w:anchor="_Toc43">
             <w:r>
-              <w:t xml:space="preserve">10.2 Aturan untuk team</w:t>
+              <w:t xml:space="preserve">10.1 Tambah user team atau rotasi password</w:t>
             </w:r>
             <w:r>
               <w:tab/>
@@ -1441,28 +1441,6 @@
             <w:r>
               <w:fldChar w:fldCharType="begin" w:dirty="true"/>
               <w:instrText xml:space="preserve">PAGEREF _Toc43 \h</w:instrText>
-              <w:fldChar w:fldCharType="separate"/>
-              <w:fldChar w:fldCharType="end"/>
-            </w:r>
-          </w:hyperlink>
-        </w:p>
-        <w:p>
-          <w:pPr>
-            <w:pStyle w:val="TOC1"/>
-            <w:tabs>
-              <w:tab w:val="right" w:pos="9638" w:leader="dot"/>
-            </w:tabs>
-          </w:pPr>
-          <w:hyperlink w:history="1" w:anchor="_Toc44">
-            <w:r>
-              <w:t xml:space="preserve">11. Ganti target dan environment baru</w:t>
-            </w:r>
-            <w:r>
-              <w:tab/>
-            </w:r>
-            <w:r>
-              <w:fldChar w:fldCharType="begin" w:dirty="true"/>
-              <w:instrText xml:space="preserve">PAGEREF _Toc44 \h</w:instrText>
               <w:fldChar w:fldCharType="separate"/>
               <w:fldChar w:fldCharType="end"/>
             </w:r>
@@ -1476,9 +1454,31 @@
             </w:tabs>
             <w:ind w:left="220"/>
           </w:pPr>
+          <w:hyperlink w:history="1" w:anchor="_Toc44">
+            <w:r>
+              <w:t xml:space="preserve">10.2 Aturan untuk team</w:t>
+            </w:r>
+            <w:r>
+              <w:tab/>
+            </w:r>
+            <w:r>
+              <w:fldChar w:fldCharType="begin" w:dirty="true"/>
+              <w:instrText xml:space="preserve">PAGEREF _Toc44 \h</w:instrText>
+              <w:fldChar w:fldCharType="separate"/>
+              <w:fldChar w:fldCharType="end"/>
+            </w:r>
+          </w:hyperlink>
+        </w:p>
+        <w:p>
+          <w:pPr>
+            <w:pStyle w:val="TOC1"/>
+            <w:tabs>
+              <w:tab w:val="right" w:pos="9638" w:leader="dot"/>
+            </w:tabs>
+          </w:pPr>
           <w:hyperlink w:history="1" w:anchor="_Toc45">
             <w:r>
-              <w:t xml:space="preserve">11.1 Ganti project, cluster, atau namespace</w:t>
+              <w:t xml:space="preserve">11. Ganti target dan environment baru</w:t>
             </w:r>
             <w:r>
               <w:tab/>
@@ -1501,7 +1501,7 @@
           </w:pPr>
           <w:hyperlink w:history="1" w:anchor="_Toc46">
             <w:r>
-              <w:t xml:space="preserve">11.2 Environment baru (misalnya prd)</w:t>
+              <w:t xml:space="preserve">11.1 Ganti project, cluster, atau namespace</w:t>
             </w:r>
             <w:r>
               <w:tab/>
@@ -1516,14 +1516,15 @@
         </w:p>
         <w:p>
           <w:pPr>
-            <w:pStyle w:val="TOC1"/>
+            <w:pStyle w:val="TOC2"/>
             <w:tabs>
               <w:tab w:val="right" w:pos="9638" w:leader="dot"/>
             </w:tabs>
+            <w:ind w:left="220"/>
           </w:pPr>
           <w:hyperlink w:history="1" w:anchor="_Toc47">
             <w:r>
-              <w:t xml:space="preserve">12. Migrasi dari chart lama</w:t>
+              <w:t xml:space="preserve">11.2 Environment baru (misalnya prd)</w:t>
             </w:r>
             <w:r>
               <w:tab/>
@@ -1545,7 +1546,7 @@
           </w:pPr>
           <w:hyperlink w:history="1" w:anchor="_Toc48">
             <w:r>
-              <w:t xml:space="preserve">13. Troubleshooting</w:t>
+              <w:t xml:space="preserve">12. Migrasi dari chart lama</w:t>
             </w:r>
             <w:r>
               <w:tab/>
@@ -1553,6 +1554,28 @@
             <w:r>
               <w:fldChar w:fldCharType="begin" w:dirty="true"/>
               <w:instrText xml:space="preserve">PAGEREF _Toc48 \h</w:instrText>
+              <w:fldChar w:fldCharType="separate"/>
+              <w:fldChar w:fldCharType="end"/>
+            </w:r>
+          </w:hyperlink>
+        </w:p>
+        <w:p>
+          <w:pPr>
+            <w:pStyle w:val="TOC1"/>
+            <w:tabs>
+              <w:tab w:val="right" w:pos="9638" w:leader="dot"/>
+            </w:tabs>
+          </w:pPr>
+          <w:hyperlink w:history="1" w:anchor="_Toc49">
+            <w:r>
+              <w:t xml:space="preserve">13. Troubleshooting</w:t>
+            </w:r>
+            <w:r>
+              <w:tab/>
+            </w:r>
+            <w:r>
+              <w:fldChar w:fldCharType="begin" w:dirty="true"/>
+              <w:instrText xml:space="preserve">PAGEREF _Toc49 \h</w:instrText>
               <w:fldChar w:fldCharType="separate"/>
               <w:fldChar w:fldCharType="end"/>
             </w:r>
@@ -1566,7 +1589,7 @@
             </w:tabs>
             <w:ind w:left="220"/>
           </w:pPr>
-          <w:hyperlink w:history="1" w:anchor="_Toc49">
+          <w:hyperlink w:history="1" w:anchor="_Toc50">
             <w:r>
               <w:t xml:space="preserve">13.1 Perintah diagnosis</w:t>
             </w:r>
@@ -1575,7 +1598,7 @@
             </w:r>
             <w:r>
               <w:fldChar w:fldCharType="begin" w:dirty="true"/>
-              <w:instrText xml:space="preserve">PAGEREF _Toc49 \h</w:instrText>
+              <w:instrText xml:space="preserve">PAGEREF _Toc50 \h</w:instrText>
               <w:fldChar w:fldCharType="separate"/>
               <w:fldChar w:fldCharType="end"/>
             </w:r>
@@ -1588,7 +1611,7 @@
               <w:tab w:val="right" w:pos="9638" w:leader="dot"/>
             </w:tabs>
           </w:pPr>
-          <w:hyperlink w:history="1" w:anchor="_Toc50">
+          <w:hyperlink w:history="1" w:anchor="_Toc51">
             <w:r>
               <w:t xml:space="preserve">14. Menambah service baru</w:t>
             </w:r>
@@ -1597,7 +1620,7 @@
             </w:r>
             <w:r>
               <w:fldChar w:fldCharType="begin" w:dirty="true"/>
-              <w:instrText xml:space="preserve">PAGEREF _Toc50 \h</w:instrText>
+              <w:instrText xml:space="preserve">PAGEREF _Toc51 \h</w:instrText>
               <w:fldChar w:fldCharType="separate"/>
               <w:fldChar w:fldCharType="end"/>
             </w:r>
@@ -1611,31 +1634,9 @@
             </w:tabs>
             <w:ind w:left="220"/>
           </w:pPr>
-          <w:hyperlink w:history="1" w:anchor="_Toc51">
+          <w:hyperlink w:history="1" w:anchor="_Toc52">
             <w:r>
               <w:t xml:space="preserve">14.1 Standar</w:t>
-            </w:r>
-            <w:r>
-              <w:tab/>
-            </w:r>
-            <w:r>
-              <w:fldChar w:fldCharType="begin" w:dirty="true"/>
-              <w:instrText xml:space="preserve">PAGEREF _Toc51 \h</w:instrText>
-              <w:fldChar w:fldCharType="separate"/>
-              <w:fldChar w:fldCharType="end"/>
-            </w:r>
-          </w:hyperlink>
-        </w:p>
-        <w:p>
-          <w:pPr>
-            <w:pStyle w:val="TOC1"/>
-            <w:tabs>
-              <w:tab w:val="right" w:pos="9638" w:leader="dot"/>
-            </w:tabs>
-          </w:pPr>
-          <w:hyperlink w:history="1" w:anchor="_Toc52">
-            <w:r>
-              <w:t xml:space="preserve">15. Aturan keamanan dan rahasia</w:t>
             </w:r>
             <w:r>
               <w:tab/>
@@ -1657,7 +1658,7 @@
           </w:pPr>
           <w:hyperlink w:history="1" w:anchor="_Toc53">
             <w:r>
-              <w:t xml:space="preserve">Lampiran A. Ringkasan perintah</w:t>
+              <w:t xml:space="preserve">15. Aturan keamanan dan rahasia</w:t>
             </w:r>
             <w:r>
               <w:tab/>
@@ -1665,6 +1666,28 @@
             <w:r>
               <w:fldChar w:fldCharType="begin" w:dirty="true"/>
               <w:instrText xml:space="preserve">PAGEREF _Toc53 \h</w:instrText>
+              <w:fldChar w:fldCharType="separate"/>
+              <w:fldChar w:fldCharType="end"/>
+            </w:r>
+          </w:hyperlink>
+        </w:p>
+        <w:p>
+          <w:pPr>
+            <w:pStyle w:val="TOC1"/>
+            <w:tabs>
+              <w:tab w:val="right" w:pos="9638" w:leader="dot"/>
+            </w:tabs>
+          </w:pPr>
+          <w:hyperlink w:history="1" w:anchor="_Toc54">
+            <w:r>
+              <w:t xml:space="preserve">Lampiran A. Ringkasan perintah</w:t>
+            </w:r>
+            <w:r>
+              <w:tab/>
+            </w:r>
+            <w:r>
+              <w:fldChar w:fldCharType="begin" w:dirty="true"/>
+              <w:instrText xml:space="preserve">PAGEREF _Toc54 \h</w:instrText>
               <w:fldChar w:fldCharType="separate"/>
               <w:fldChar w:fldCharType="end"/>
             </w:r>
@@ -2700,7 +2723,7 @@
                 <w:sz w:val="15"/>
                 <w:szCs w:val="15"/>
               </w:rPr>
-              <w:t xml:space="preserve">ocr-orchestration-api</w:t>
+              <w:t xml:space="preserve">ms-bribrain-nilam-ocr-orchestrator-api</w:t>
             </w:r>
             <w:r>
               <w:rPr>
@@ -2716,7 +2739,7 @@
                 <w:sz w:val="15"/>
                 <w:szCs w:val="15"/>
               </w:rPr>
-              <w:t xml:space="preserve">ocr-orchestration-worker</w:t>
+              <w:t xml:space="preserve">ms-bribrain-nilam-ocr-orchestrator-worker</w:t>
             </w:r>
             <w:r>
               <w:rPr>
@@ -2732,7 +2755,7 @@
                 <w:sz w:val="15"/>
                 <w:szCs w:val="15"/>
               </w:rPr>
-              <w:t xml:space="preserve">ocr-orchestration</w:t>
+              <w:t xml:space="preserve">ms-bribrain-nilam-ocr-orchestrator</w:t>
             </w:r>
             <w:r>
               <w:rPr>
@@ -2865,7 +2888,7 @@
                 <w:sz w:val="15"/>
                 <w:szCs w:val="15"/>
               </w:rPr>
-              <w:t xml:space="preserve">ms-bribrain-nilam-ocr-rbac-ui</w:t>
+              <w:t xml:space="preserve">mf-bribrain-nilam-ocr-admin-ui</w:t>
             </w:r>
           </w:p>
         </w:tc>
@@ -2903,7 +2926,7 @@
                 <w:sz w:val="15"/>
                 <w:szCs w:val="15"/>
               </w:rPr>
-              <w:t xml:space="preserve">ocr-admin-ui</w:t>
+              <w:t xml:space="preserve">mf-bribrain-nilam-ocr-admin-ui</w:t>
             </w:r>
           </w:p>
         </w:tc>
@@ -6365,7 +6388,7 @@
           <w:sz w:val="17"/>
           <w:szCs w:val="17"/>
         </w:rPr>
-        <w:t xml:space="preserve">new-nexus.gcp.bri.co.id/bribrain/dev/nilam/nilam-ocr-orchestrator/ms-bribrain-nilam-ocr-rbac-ui:&lt;git-short-sha&gt;</w:t>
+        <w:t xml:space="preserve">new-nexus.gcp.bri.co.id/bribrain/dev/nilam/nilam-ocr-orchestrator/mf-bribrain-nilam-ocr-admin-ui:&lt;git-short-sha&gt;</w:t>
       </w:r>
     </w:p>
     <w:p>
@@ -6387,7 +6410,31 @@
         <w:t xml:space="preserve">&lt;image&gt;</w:t>
       </w:r>
       <w:r>
-        <w:t xml:space="preserve"> harus sama dengan nama image di konfigurasi service (</w:t>
+        <w:t xml:space="preserve"> adalah nama repo Bitbucket service: </w:t>
+      </w:r>
+      <w:r>
+        <w:rPr>
+          <w:rFonts w:ascii="Menlo" w:cs="Menlo" w:eastAsia="Menlo" w:hAnsi="Menlo"/>
+          <w:color w:val="8A1538"/>
+          <w:sz w:val="18"/>
+          <w:szCs w:val="18"/>
+        </w:rPr>
+        <w:t xml:space="preserve">ms-bribrain-nilam-ocr-orchestrator</w:t>
+      </w:r>
+      <w:r>
+        <w:t xml:space="preserve"> (backend) dan </w:t>
+      </w:r>
+      <w:r>
+        <w:rPr>
+          <w:rFonts w:ascii="Menlo" w:cs="Menlo" w:eastAsia="Menlo" w:hAnsi="Menlo"/>
+          <w:color w:val="8A1538"/>
+          <w:sz w:val="18"/>
+          <w:szCs w:val="18"/>
+        </w:rPr>
+        <w:t xml:space="preserve">mf-bribrain-nilam-ocr-admin-ui</w:t>
+      </w:r>
+      <w:r>
+        <w:t xml:space="preserve"> (admin UI). Nama ini harus sama dengan </w:t>
       </w:r>
       <w:r>
         <w:rPr>
@@ -6399,7 +6446,7 @@
         <w:t xml:space="preserve">BACKEND_IMAGE</w:t>
       </w:r>
       <w:r>
-        <w:t xml:space="preserve">, </w:t>
+        <w:t xml:space="preserve">/</w:t>
       </w:r>
       <w:r>
         <w:rPr>
@@ -6423,7 +6470,7 @@
         <w:t xml:space="preserve">environments/&lt;env&gt;.env</w:t>
       </w:r>
       <w:r>
-        <w:t xml:space="preserve">).</w:t>
+        <w:t xml:space="preserve"> (lihat Bagian 4.5).</w:t>
       </w:r>
     </w:p>
     <w:p>
@@ -6632,6 +6679,75 @@
       </w:pPr>
       <w:r>
         <w:t xml:space="preserve">Pastikan push berhasil dan tag tersedia di Nexus sebelum lanjut. Script deploy memeriksa image/tag di Nexus dan berhenti bila image belum ada.</w:t>
+      </w:r>
+    </w:p>
+    <w:p>
+      <w:pPr>
+        <w:pBdr>
+          <w:left w:val="single" w:color="D97706" w:sz="24" w:space="8"/>
+        </w:pBdr>
+        <w:shd w:fill="FFF7E6" w:color="auto" w:val="clear"/>
+        <w:spacing w:after="200" w:before="80" w:line="276"/>
+        <w:ind w:left="160"/>
+      </w:pPr>
+      <w:r>
+        <w:rPr>
+          <w:b/>
+          <w:bCs/>
+          <w:color w:val="D97706"/>
+        </w:rPr>
+        <w:t xml:space="preserve">Penting: </w:t>
+      </w:r>
+      <w:r>
+        <w:t xml:space="preserve">Bila memakai </w:t>
+      </w:r>
+      <w:r>
+        <w:rPr>
+          <w:rFonts w:ascii="Menlo" w:cs="Menlo" w:eastAsia="Menlo" w:hAnsi="Menlo"/>
+          <w:color w:val="8A1538"/>
+          <w:sz w:val="18"/>
+          <w:szCs w:val="18"/>
+        </w:rPr>
+        <w:t xml:space="preserve">push-nexus.sh</w:t>
+      </w:r>
+      <w:r>
+        <w:t xml:space="preserve">, cek daftar </w:t>
+      </w:r>
+      <w:r>
+        <w:rPr>
+          <w:rFonts w:ascii="Menlo" w:cs="Menlo" w:eastAsia="Menlo" w:hAnsi="Menlo"/>
+          <w:color w:val="8A1538"/>
+          <w:sz w:val="18"/>
+          <w:szCs w:val="18"/>
+        </w:rPr>
+        <w:t xml:space="preserve">IMAGES</w:t>
+      </w:r>
+      <w:r>
+        <w:t xml:space="preserve"> di script itu: admin UI harus di-push sebagai </w:t>
+      </w:r>
+      <w:r>
+        <w:rPr>
+          <w:rFonts w:ascii="Menlo" w:cs="Menlo" w:eastAsia="Menlo" w:hAnsi="Menlo"/>
+          <w:color w:val="8A1538"/>
+          <w:sz w:val="18"/>
+          <w:szCs w:val="18"/>
+        </w:rPr>
+        <w:t xml:space="preserve">mf-bribrain-nilam-ocr-admin-ui</w:t>
+      </w:r>
+      <w:r>
+        <w:t xml:space="preserve">. Nama lama </w:t>
+      </w:r>
+      <w:r>
+        <w:rPr>
+          <w:rFonts w:ascii="Menlo" w:cs="Menlo" w:eastAsia="Menlo" w:hAnsi="Menlo"/>
+          <w:color w:val="8A1538"/>
+          <w:sz w:val="18"/>
+          <w:szCs w:val="18"/>
+        </w:rPr>
+        <w:t xml:space="preserve">ms-bribrain-nilam-ocr-rbac-ui</w:t>
+      </w:r>
+      <w:r>
+        <w:t xml:space="preserve"> tidak lagi dipakai konfigurasi deploy, sehingga cek image akan gagal.</w:t>
       </w:r>
     </w:p>
     <w:p>
@@ -9279,14 +9395,936 @@
     </w:p>
     <w:p>
       <w:pPr>
+        <w:pStyle w:val="Heading2"/>
+      </w:pPr>
+      <w:bookmarkStart w:name="_Toc20" w:id="20"/>
+      <w:r>
+        <w:t xml:space="preserve">4.5 Konvensi penamaan</w:t>
+      </w:r>
+      <w:bookmarkEnd w:id="20"/>
+    </w:p>
+    <w:p>
+      <w:pPr>
+        <w:spacing w:after="140" w:line="288"/>
+      </w:pPr>
+      <w:r>
+        <w:t xml:space="preserve">Satu nama dipakai dari Bitbucket sampai cluster: nama repo Bitbucket = nama image di Nexus = </w:t>
+      </w:r>
+      <w:r>
+        <w:rPr>
+          <w:rFonts w:ascii="Menlo" w:cs="Menlo" w:eastAsia="Menlo" w:hAnsi="Menlo"/>
+          <w:color w:val="8A1538"/>
+          <w:sz w:val="18"/>
+          <w:szCs w:val="18"/>
+        </w:rPr>
+        <w:t xml:space="preserve">fullnameOverride</w:t>
+      </w:r>
+      <w:r>
+        <w:t xml:space="preserve"> di </w:t>
+      </w:r>
+      <w:r>
+        <w:rPr>
+          <w:rFonts w:ascii="Menlo" w:cs="Menlo" w:eastAsia="Menlo" w:hAnsi="Menlo"/>
+          <w:color w:val="8A1538"/>
+          <w:sz w:val="18"/>
+          <w:szCs w:val="18"/>
+        </w:rPr>
+        <w:t xml:space="preserve">environments/&lt;env&gt;/&lt;chart&gt;.yaml</w:t>
+      </w:r>
+      <w:r>
+        <w:t xml:space="preserve">. Dengan begitu objek di cluster langsung bisa ditelusuri ke repo dan image-nya.</w:t>
+      </w:r>
+    </w:p>
+    <w:tbl>
+      <w:tblPr>
+        <w:tblW w:type="dxa" w:w="9638"/>
+        <w:tblBorders>
+          <w:top w:val="single" w:color="auto" w:sz="4"/>
+          <w:left w:val="single" w:color="auto" w:sz="4"/>
+          <w:bottom w:val="single" w:color="auto" w:sz="4"/>
+          <w:right w:val="single" w:color="auto" w:sz="4"/>
+          <w:insideH w:val="single" w:color="auto" w:sz="4"/>
+          <w:insideV w:val="single" w:color="auto" w:sz="4"/>
+        </w:tblBorders>
+      </w:tblPr>
+      <w:tblGrid>
+        <w:gridCol w:w="1500"/>
+        <w:gridCol w:w="2500"/>
+        <w:gridCol w:w="2938"/>
+        <w:gridCol w:w="1300"/>
+        <w:gridCol w:w="1400"/>
+      </w:tblGrid>
+      <w:tr>
+        <w:trPr>
+          <w:cantSplit/>
+          <w:tblHeader/>
+        </w:trPr>
+        <w:tc>
+          <w:tcPr>
+            <w:tcW w:type="dxa" w:w="1500"/>
+            <w:tcBorders>
+              <w:top w:val="single" w:color="D1D5DB" w:sz="4"/>
+              <w:left w:val="single" w:color="D1D5DB" w:sz="4"/>
+              <w:bottom w:val="single" w:color="D1D5DB" w:sz="4"/>
+              <w:right w:val="single" w:color="D1D5DB" w:sz="4"/>
+            </w:tcBorders>
+            <w:shd w:fill="1F3A5F" w:color="auto" w:val="clear"/>
+            <w:tcMar>
+              <w:top w:type="dxa" w:w="70"/>
+              <w:left w:type="dxa" w:w="110"/>
+              <w:bottom w:type="dxa" w:w="70"/>
+              <w:right w:type="dxa" w:w="110"/>
+            </w:tcMar>
+          </w:tcPr>
+          <w:p>
+            <w:pPr>
+              <w:spacing w:after="40" w:line="252"/>
+            </w:pPr>
+            <w:r>
+              <w:rPr>
+                <w:b/>
+                <w:bCs/>
+                <w:color w:val="FFFFFF"/>
+                <w:sz w:val="18"/>
+                <w:szCs w:val="18"/>
+              </w:rPr>
+              <w:t xml:space="preserve">Komponen</w:t>
+            </w:r>
+          </w:p>
+        </w:tc>
+        <w:tc>
+          <w:tcPr>
+            <w:tcW w:type="dxa" w:w="2500"/>
+            <w:tcBorders>
+              <w:top w:val="single" w:color="D1D5DB" w:sz="4"/>
+              <w:left w:val="single" w:color="D1D5DB" w:sz="4"/>
+              <w:bottom w:val="single" w:color="D1D5DB" w:sz="4"/>
+              <w:right w:val="single" w:color="D1D5DB" w:sz="4"/>
+            </w:tcBorders>
+            <w:shd w:fill="1F3A5F" w:color="auto" w:val="clear"/>
+            <w:tcMar>
+              <w:top w:type="dxa" w:w="70"/>
+              <w:left w:type="dxa" w:w="110"/>
+              <w:bottom w:type="dxa" w:w="70"/>
+              <w:right w:type="dxa" w:w="110"/>
+            </w:tcMar>
+          </w:tcPr>
+          <w:p>
+            <w:pPr>
+              <w:spacing w:after="40" w:line="252"/>
+            </w:pPr>
+            <w:r>
+              <w:rPr>
+                <w:b/>
+                <w:bCs/>
+                <w:color w:val="FFFFFF"/>
+                <w:sz w:val="18"/>
+                <w:szCs w:val="18"/>
+              </w:rPr>
+              <w:t xml:space="preserve">Repo Bitbucket / image Nexus</w:t>
+            </w:r>
+          </w:p>
+        </w:tc>
+        <w:tc>
+          <w:tcPr>
+            <w:tcW w:type="dxa" w:w="2938"/>
+            <w:tcBorders>
+              <w:top w:val="single" w:color="D1D5DB" w:sz="4"/>
+              <w:left w:val="single" w:color="D1D5DB" w:sz="4"/>
+              <w:bottom w:val="single" w:color="D1D5DB" w:sz="4"/>
+              <w:right w:val="single" w:color="D1D5DB" w:sz="4"/>
+            </w:tcBorders>
+            <w:shd w:fill="1F3A5F" w:color="auto" w:val="clear"/>
+            <w:tcMar>
+              <w:top w:type="dxa" w:w="70"/>
+              <w:left w:type="dxa" w:w="110"/>
+              <w:bottom w:type="dxa" w:w="70"/>
+              <w:right w:type="dxa" w:w="110"/>
+            </w:tcMar>
+          </w:tcPr>
+          <w:p>
+            <w:pPr>
+              <w:spacing w:after="40" w:line="252"/>
+            </w:pPr>
+            <w:r>
+              <w:rPr>
+                <w:b/>
+                <w:bCs/>
+                <w:color w:val="FFFFFF"/>
+                <w:sz w:val="18"/>
+                <w:szCs w:val="18"/>
+              </w:rPr>
+              <w:t xml:space="preserve">Objek di cluster</w:t>
+            </w:r>
+          </w:p>
+        </w:tc>
+        <w:tc>
+          <w:tcPr>
+            <w:tcW w:type="dxa" w:w="1300"/>
+            <w:tcBorders>
+              <w:top w:val="single" w:color="D1D5DB" w:sz="4"/>
+              <w:left w:val="single" w:color="D1D5DB" w:sz="4"/>
+              <w:bottom w:val="single" w:color="D1D5DB" w:sz="4"/>
+              <w:right w:val="single" w:color="D1D5DB" w:sz="4"/>
+            </w:tcBorders>
+            <w:shd w:fill="1F3A5F" w:color="auto" w:val="clear"/>
+            <w:tcMar>
+              <w:top w:type="dxa" w:w="70"/>
+              <w:left w:type="dxa" w:w="110"/>
+              <w:bottom w:type="dxa" w:w="70"/>
+              <w:right w:type="dxa" w:w="110"/>
+            </w:tcMar>
+          </w:tcPr>
+          <w:p>
+            <w:pPr>
+              <w:spacing w:after="40" w:line="252"/>
+            </w:pPr>
+            <w:r>
+              <w:rPr>
+                <w:b/>
+                <w:bCs/>
+                <w:color w:val="FFFFFF"/>
+                <w:sz w:val="18"/>
+                <w:szCs w:val="18"/>
+              </w:rPr>
+              <w:t xml:space="preserve">Release Helm</w:t>
+            </w:r>
+          </w:p>
+        </w:tc>
+        <w:tc>
+          <w:tcPr>
+            <w:tcW w:type="dxa" w:w="1400"/>
+            <w:tcBorders>
+              <w:top w:val="single" w:color="D1D5DB" w:sz="4"/>
+              <w:left w:val="single" w:color="D1D5DB" w:sz="4"/>
+              <w:bottom w:val="single" w:color="D1D5DB" w:sz="4"/>
+              <w:right w:val="single" w:color="D1D5DB" w:sz="4"/>
+            </w:tcBorders>
+            <w:shd w:fill="1F3A5F" w:color="auto" w:val="clear"/>
+            <w:tcMar>
+              <w:top w:type="dxa" w:w="70"/>
+              <w:left w:type="dxa" w:w="110"/>
+              <w:bottom w:type="dxa" w:w="70"/>
+              <w:right w:type="dxa" w:w="110"/>
+            </w:tcMar>
+          </w:tcPr>
+          <w:p>
+            <w:pPr>
+              <w:spacing w:after="40" w:line="252"/>
+            </w:pPr>
+            <w:r>
+              <w:rPr>
+                <w:b/>
+                <w:bCs/>
+                <w:color w:val="FFFFFF"/>
+                <w:sz w:val="18"/>
+                <w:szCs w:val="18"/>
+              </w:rPr>
+              <w:t xml:space="preserve">Secret aplikasi</w:t>
+            </w:r>
+          </w:p>
+        </w:tc>
+      </w:tr>
+      <w:tr>
+        <w:trPr>
+          <w:cantSplit/>
+        </w:trPr>
+        <w:tc>
+          <w:tcPr>
+            <w:tcW w:type="dxa" w:w="1500"/>
+            <w:tcBorders>
+              <w:top w:val="single" w:color="D1D5DB" w:sz="4"/>
+              <w:left w:val="single" w:color="D1D5DB" w:sz="4"/>
+              <w:bottom w:val="single" w:color="D1D5DB" w:sz="4"/>
+              <w:right w:val="single" w:color="D1D5DB" w:sz="4"/>
+            </w:tcBorders>
+            <w:tcMar>
+              <w:top w:type="dxa" w:w="70"/>
+              <w:left w:type="dxa" w:w="110"/>
+              <w:bottom w:type="dxa" w:w="70"/>
+              <w:right w:type="dxa" w:w="110"/>
+            </w:tcMar>
+          </w:tcPr>
+          <w:p>
+            <w:pPr>
+              <w:spacing w:after="40" w:line="252"/>
+            </w:pPr>
+            <w:r>
+              <w:rPr>
+                <w:sz w:val="18"/>
+                <w:szCs w:val="18"/>
+              </w:rPr>
+              <w:t xml:space="preserve">OCR backend</w:t>
+            </w:r>
+          </w:p>
+        </w:tc>
+        <w:tc>
+          <w:tcPr>
+            <w:tcW w:type="dxa" w:w="2500"/>
+            <w:tcBorders>
+              <w:top w:val="single" w:color="D1D5DB" w:sz="4"/>
+              <w:left w:val="single" w:color="D1D5DB" w:sz="4"/>
+              <w:bottom w:val="single" w:color="D1D5DB" w:sz="4"/>
+              <w:right w:val="single" w:color="D1D5DB" w:sz="4"/>
+            </w:tcBorders>
+            <w:tcMar>
+              <w:top w:type="dxa" w:w="70"/>
+              <w:left w:type="dxa" w:w="110"/>
+              <w:bottom w:type="dxa" w:w="70"/>
+              <w:right w:type="dxa" w:w="110"/>
+            </w:tcMar>
+          </w:tcPr>
+          <w:p>
+            <w:pPr>
+              <w:spacing w:after="40" w:line="252"/>
+            </w:pPr>
+            <w:r>
+              <w:rPr>
+                <w:rFonts w:ascii="Menlo" w:cs="Menlo" w:eastAsia="Menlo" w:hAnsi="Menlo"/>
+                <w:color w:val="8A1538"/>
+                <w:sz w:val="15"/>
+                <w:szCs w:val="15"/>
+              </w:rPr>
+              <w:t xml:space="preserve">ms-bribrain-nilam-ocr-orchestrator</w:t>
+            </w:r>
+          </w:p>
+        </w:tc>
+        <w:tc>
+          <w:tcPr>
+            <w:tcW w:type="dxa" w:w="2938"/>
+            <w:tcBorders>
+              <w:top w:val="single" w:color="D1D5DB" w:sz="4"/>
+              <w:left w:val="single" w:color="D1D5DB" w:sz="4"/>
+              <w:bottom w:val="single" w:color="D1D5DB" w:sz="4"/>
+              <w:right w:val="single" w:color="D1D5DB" w:sz="4"/>
+            </w:tcBorders>
+            <w:tcMar>
+              <w:top w:type="dxa" w:w="70"/>
+              <w:left w:type="dxa" w:w="110"/>
+              <w:bottom w:type="dxa" w:w="70"/>
+              <w:right w:type="dxa" w:w="110"/>
+            </w:tcMar>
+          </w:tcPr>
+          <w:p>
+            <w:pPr>
+              <w:spacing w:after="40" w:line="252"/>
+            </w:pPr>
+            <w:r>
+              <w:rPr>
+                <w:sz w:val="18"/>
+                <w:szCs w:val="18"/>
+              </w:rPr>
+              <w:t xml:space="preserve">Service, ServiceAccount: </w:t>
+            </w:r>
+            <w:r>
+              <w:rPr>
+                <w:rFonts w:ascii="Menlo" w:cs="Menlo" w:eastAsia="Menlo" w:hAnsi="Menlo"/>
+                <w:color w:val="8A1538"/>
+                <w:sz w:val="15"/>
+                <w:szCs w:val="15"/>
+              </w:rPr>
+              <w:t xml:space="preserve">ms-bribrain-nilam-ocr-orchestrator</w:t>
+            </w:r>
+          </w:p>
+          <w:p>
+            <w:pPr>
+              <w:spacing w:after="40" w:line="252"/>
+            </w:pPr>
+            <w:r>
+              <w:rPr>
+                <w:sz w:val="18"/>
+                <w:szCs w:val="18"/>
+              </w:rPr>
+              <w:t xml:space="preserve">Deployment, HPA, PDB: </w:t>
+            </w:r>
+            <w:r>
+              <w:rPr>
+                <w:rFonts w:ascii="Menlo" w:cs="Menlo" w:eastAsia="Menlo" w:hAnsi="Menlo"/>
+                <w:color w:val="8A1538"/>
+                <w:sz w:val="15"/>
+                <w:szCs w:val="15"/>
+              </w:rPr>
+              <w:t xml:space="preserve">...-api</w:t>
+            </w:r>
+            <w:r>
+              <w:rPr>
+                <w:sz w:val="18"/>
+                <w:szCs w:val="18"/>
+              </w:rPr>
+              <w:t xml:space="preserve">, </w:t>
+            </w:r>
+            <w:r>
+              <w:rPr>
+                <w:rFonts w:ascii="Menlo" w:cs="Menlo" w:eastAsia="Menlo" w:hAnsi="Menlo"/>
+                <w:color w:val="8A1538"/>
+                <w:sz w:val="15"/>
+                <w:szCs w:val="15"/>
+              </w:rPr>
+              <w:t xml:space="preserve">...-worker</w:t>
+            </w:r>
+          </w:p>
+        </w:tc>
+        <w:tc>
+          <w:tcPr>
+            <w:tcW w:type="dxa" w:w="1300"/>
+            <w:tcBorders>
+              <w:top w:val="single" w:color="D1D5DB" w:sz="4"/>
+              <w:left w:val="single" w:color="D1D5DB" w:sz="4"/>
+              <w:bottom w:val="single" w:color="D1D5DB" w:sz="4"/>
+              <w:right w:val="single" w:color="D1D5DB" w:sz="4"/>
+            </w:tcBorders>
+            <w:tcMar>
+              <w:top w:type="dxa" w:w="70"/>
+              <w:left w:type="dxa" w:w="110"/>
+              <w:bottom w:type="dxa" w:w="70"/>
+              <w:right w:type="dxa" w:w="110"/>
+            </w:tcMar>
+          </w:tcPr>
+          <w:p>
+            <w:pPr>
+              <w:spacing w:after="40" w:line="252"/>
+            </w:pPr>
+            <w:r>
+              <w:rPr>
+                <w:rFonts w:ascii="Menlo" w:cs="Menlo" w:eastAsia="Menlo" w:hAnsi="Menlo"/>
+                <w:color w:val="8A1538"/>
+                <w:sz w:val="15"/>
+                <w:szCs w:val="15"/>
+              </w:rPr>
+              <w:t xml:space="preserve">ocr-backend</w:t>
+            </w:r>
+          </w:p>
+        </w:tc>
+        <w:tc>
+          <w:tcPr>
+            <w:tcW w:type="dxa" w:w="1400"/>
+            <w:tcBorders>
+              <w:top w:val="single" w:color="D1D5DB" w:sz="4"/>
+              <w:left w:val="single" w:color="D1D5DB" w:sz="4"/>
+              <w:bottom w:val="single" w:color="D1D5DB" w:sz="4"/>
+              <w:right w:val="single" w:color="D1D5DB" w:sz="4"/>
+            </w:tcBorders>
+            <w:tcMar>
+              <w:top w:type="dxa" w:w="70"/>
+              <w:left w:type="dxa" w:w="110"/>
+              <w:bottom w:type="dxa" w:w="70"/>
+              <w:right w:type="dxa" w:w="110"/>
+            </w:tcMar>
+          </w:tcPr>
+          <w:p>
+            <w:pPr>
+              <w:spacing w:after="40" w:line="252"/>
+            </w:pPr>
+            <w:r>
+              <w:rPr>
+                <w:rFonts w:ascii="Menlo" w:cs="Menlo" w:eastAsia="Menlo" w:hAnsi="Menlo"/>
+                <w:color w:val="8A1538"/>
+                <w:sz w:val="15"/>
+                <w:szCs w:val="15"/>
+              </w:rPr>
+              <w:t xml:space="preserve">ocr-orchestration</w:t>
+            </w:r>
+          </w:p>
+        </w:tc>
+      </w:tr>
+      <w:tr>
+        <w:trPr>
+          <w:cantSplit/>
+        </w:trPr>
+        <w:tc>
+          <w:tcPr>
+            <w:tcW w:type="dxa" w:w="1500"/>
+            <w:tcBorders>
+              <w:top w:val="single" w:color="D1D5DB" w:sz="4"/>
+              <w:left w:val="single" w:color="D1D5DB" w:sz="4"/>
+              <w:bottom w:val="single" w:color="D1D5DB" w:sz="4"/>
+              <w:right w:val="single" w:color="D1D5DB" w:sz="4"/>
+            </w:tcBorders>
+            <w:tcMar>
+              <w:top w:type="dxa" w:w="70"/>
+              <w:left w:type="dxa" w:w="110"/>
+              <w:bottom w:type="dxa" w:w="70"/>
+              <w:right w:type="dxa" w:w="110"/>
+            </w:tcMar>
+          </w:tcPr>
+          <w:p>
+            <w:pPr>
+              <w:spacing w:after="40" w:line="252"/>
+            </w:pPr>
+            <w:r>
+              <w:rPr>
+                <w:sz w:val="18"/>
+                <w:szCs w:val="18"/>
+              </w:rPr>
+              <w:t xml:space="preserve">Admin UI</w:t>
+            </w:r>
+          </w:p>
+        </w:tc>
+        <w:tc>
+          <w:tcPr>
+            <w:tcW w:type="dxa" w:w="2500"/>
+            <w:tcBorders>
+              <w:top w:val="single" w:color="D1D5DB" w:sz="4"/>
+              <w:left w:val="single" w:color="D1D5DB" w:sz="4"/>
+              <w:bottom w:val="single" w:color="D1D5DB" w:sz="4"/>
+              <w:right w:val="single" w:color="D1D5DB" w:sz="4"/>
+            </w:tcBorders>
+            <w:tcMar>
+              <w:top w:type="dxa" w:w="70"/>
+              <w:left w:type="dxa" w:w="110"/>
+              <w:bottom w:type="dxa" w:w="70"/>
+              <w:right w:type="dxa" w:w="110"/>
+            </w:tcMar>
+          </w:tcPr>
+          <w:p>
+            <w:pPr>
+              <w:spacing w:after="40" w:line="252"/>
+            </w:pPr>
+            <w:r>
+              <w:rPr>
+                <w:rFonts w:ascii="Menlo" w:cs="Menlo" w:eastAsia="Menlo" w:hAnsi="Menlo"/>
+                <w:color w:val="8A1538"/>
+                <w:sz w:val="15"/>
+                <w:szCs w:val="15"/>
+              </w:rPr>
+              <w:t xml:space="preserve">mf-bribrain-nilam-ocr-admin-ui</w:t>
+            </w:r>
+          </w:p>
+        </w:tc>
+        <w:tc>
+          <w:tcPr>
+            <w:tcW w:type="dxa" w:w="2938"/>
+            <w:tcBorders>
+              <w:top w:val="single" w:color="D1D5DB" w:sz="4"/>
+              <w:left w:val="single" w:color="D1D5DB" w:sz="4"/>
+              <w:bottom w:val="single" w:color="D1D5DB" w:sz="4"/>
+              <w:right w:val="single" w:color="D1D5DB" w:sz="4"/>
+            </w:tcBorders>
+            <w:tcMar>
+              <w:top w:type="dxa" w:w="70"/>
+              <w:left w:type="dxa" w:w="110"/>
+              <w:bottom w:type="dxa" w:w="70"/>
+              <w:right w:type="dxa" w:w="110"/>
+            </w:tcMar>
+          </w:tcPr>
+          <w:p>
+            <w:pPr>
+              <w:spacing w:after="40" w:line="252"/>
+            </w:pPr>
+            <w:r>
+              <w:rPr>
+                <w:sz w:val="18"/>
+                <w:szCs w:val="18"/>
+              </w:rPr>
+              <w:t xml:space="preserve">Deployment, Service, HPA, PDB: </w:t>
+            </w:r>
+            <w:r>
+              <w:rPr>
+                <w:rFonts w:ascii="Menlo" w:cs="Menlo" w:eastAsia="Menlo" w:hAnsi="Menlo"/>
+                <w:color w:val="8A1538"/>
+                <w:sz w:val="15"/>
+                <w:szCs w:val="15"/>
+              </w:rPr>
+              <w:t xml:space="preserve">mf-bribrain-nilam-ocr-admin-ui</w:t>
+            </w:r>
+          </w:p>
+        </w:tc>
+        <w:tc>
+          <w:tcPr>
+            <w:tcW w:type="dxa" w:w="1300"/>
+            <w:tcBorders>
+              <w:top w:val="single" w:color="D1D5DB" w:sz="4"/>
+              <w:left w:val="single" w:color="D1D5DB" w:sz="4"/>
+              <w:bottom w:val="single" w:color="D1D5DB" w:sz="4"/>
+              <w:right w:val="single" w:color="D1D5DB" w:sz="4"/>
+            </w:tcBorders>
+            <w:tcMar>
+              <w:top w:type="dxa" w:w="70"/>
+              <w:left w:type="dxa" w:w="110"/>
+              <w:bottom w:type="dxa" w:w="70"/>
+              <w:right w:type="dxa" w:w="110"/>
+            </w:tcMar>
+          </w:tcPr>
+          <w:p>
+            <w:pPr>
+              <w:spacing w:after="40" w:line="252"/>
+            </w:pPr>
+            <w:r>
+              <w:rPr>
+                <w:rFonts w:ascii="Menlo" w:cs="Menlo" w:eastAsia="Menlo" w:hAnsi="Menlo"/>
+                <w:color w:val="8A1538"/>
+                <w:sz w:val="15"/>
+                <w:szCs w:val="15"/>
+              </w:rPr>
+              <w:t xml:space="preserve">ocr-rbac-ui</w:t>
+            </w:r>
+          </w:p>
+        </w:tc>
+        <w:tc>
+          <w:tcPr>
+            <w:tcW w:type="dxa" w:w="1400"/>
+            <w:tcBorders>
+              <w:top w:val="single" w:color="D1D5DB" w:sz="4"/>
+              <w:left w:val="single" w:color="D1D5DB" w:sz="4"/>
+              <w:bottom w:val="single" w:color="D1D5DB" w:sz="4"/>
+              <w:right w:val="single" w:color="D1D5DB" w:sz="4"/>
+            </w:tcBorders>
+            <w:tcMar>
+              <w:top w:type="dxa" w:w="70"/>
+              <w:left w:type="dxa" w:w="110"/>
+              <w:bottom w:type="dxa" w:w="70"/>
+              <w:right w:type="dxa" w:w="110"/>
+            </w:tcMar>
+          </w:tcPr>
+          <w:p>
+            <w:pPr>
+              <w:spacing w:after="40" w:line="252"/>
+            </w:pPr>
+            <w:r>
+              <w:rPr>
+                <w:sz w:val="18"/>
+                <w:szCs w:val="18"/>
+              </w:rPr>
+              <w:t xml:space="preserve">-</w:t>
+            </w:r>
+          </w:p>
+        </w:tc>
+      </w:tr>
+      <w:tr>
+        <w:trPr>
+          <w:cantSplit/>
+        </w:trPr>
+        <w:tc>
+          <w:tcPr>
+            <w:tcW w:type="dxa" w:w="1500"/>
+            <w:tcBorders>
+              <w:top w:val="single" w:color="D1D5DB" w:sz="4"/>
+              <w:left w:val="single" w:color="D1D5DB" w:sz="4"/>
+              <w:bottom w:val="single" w:color="D1D5DB" w:sz="4"/>
+              <w:right w:val="single" w:color="D1D5DB" w:sz="4"/>
+            </w:tcBorders>
+            <w:tcMar>
+              <w:top w:type="dxa" w:w="70"/>
+              <w:left w:type="dxa" w:w="110"/>
+              <w:bottom w:type="dxa" w:w="70"/>
+              <w:right w:type="dxa" w:w="110"/>
+            </w:tcMar>
+          </w:tcPr>
+          <w:p>
+            <w:pPr>
+              <w:spacing w:after="40" w:line="252"/>
+            </w:pPr>
+            <w:r>
+              <w:rPr>
+                <w:sz w:val="18"/>
+                <w:szCs w:val="18"/>
+              </w:rPr>
+              <w:t xml:space="preserve">Redis bersama</w:t>
+            </w:r>
+          </w:p>
+        </w:tc>
+        <w:tc>
+          <w:tcPr>
+            <w:tcW w:type="dxa" w:w="2500"/>
+            <w:tcBorders>
+              <w:top w:val="single" w:color="D1D5DB" w:sz="4"/>
+              <w:left w:val="single" w:color="D1D5DB" w:sz="4"/>
+              <w:bottom w:val="single" w:color="D1D5DB" w:sz="4"/>
+              <w:right w:val="single" w:color="D1D5DB" w:sz="4"/>
+            </w:tcBorders>
+            <w:tcMar>
+              <w:top w:type="dxa" w:w="70"/>
+              <w:left w:type="dxa" w:w="110"/>
+              <w:bottom w:type="dxa" w:w="70"/>
+              <w:right w:type="dxa" w:w="110"/>
+            </w:tcMar>
+          </w:tcPr>
+          <w:p>
+            <w:pPr>
+              <w:spacing w:after="40" w:line="252"/>
+            </w:pPr>
+            <w:r>
+              <w:rPr>
+                <w:rFonts w:ascii="Menlo" w:cs="Menlo" w:eastAsia="Menlo" w:hAnsi="Menlo"/>
+                <w:color w:val="8A1538"/>
+                <w:sz w:val="15"/>
+                <w:szCs w:val="15"/>
+              </w:rPr>
+              <w:t xml:space="preserve">redis</w:t>
+            </w:r>
+            <w:r>
+              <w:rPr>
+                <w:sz w:val="18"/>
+                <w:szCs w:val="18"/>
+              </w:rPr>
+              <w:t xml:space="preserve"> (salinan Docker Hub)</w:t>
+            </w:r>
+          </w:p>
+        </w:tc>
+        <w:tc>
+          <w:tcPr>
+            <w:tcW w:type="dxa" w:w="2938"/>
+            <w:tcBorders>
+              <w:top w:val="single" w:color="D1D5DB" w:sz="4"/>
+              <w:left w:val="single" w:color="D1D5DB" w:sz="4"/>
+              <w:bottom w:val="single" w:color="D1D5DB" w:sz="4"/>
+              <w:right w:val="single" w:color="D1D5DB" w:sz="4"/>
+            </w:tcBorders>
+            <w:tcMar>
+              <w:top w:type="dxa" w:w="70"/>
+              <w:left w:type="dxa" w:w="110"/>
+              <w:bottom w:type="dxa" w:w="70"/>
+              <w:right w:type="dxa" w:w="110"/>
+            </w:tcMar>
+          </w:tcPr>
+          <w:p>
+            <w:pPr>
+              <w:spacing w:after="40" w:line="252"/>
+            </w:pPr>
+            <w:r>
+              <w:rPr>
+                <w:sz w:val="18"/>
+                <w:szCs w:val="18"/>
+              </w:rPr>
+              <w:t xml:space="preserve">StatefulSet, Service: </w:t>
+            </w:r>
+            <w:r>
+              <w:rPr>
+                <w:rFonts w:ascii="Menlo" w:cs="Menlo" w:eastAsia="Menlo" w:hAnsi="Menlo"/>
+                <w:color w:val="8A1538"/>
+                <w:sz w:val="15"/>
+                <w:szCs w:val="15"/>
+              </w:rPr>
+              <w:t xml:space="preserve">shared-redis</w:t>
+            </w:r>
+          </w:p>
+        </w:tc>
+        <w:tc>
+          <w:tcPr>
+            <w:tcW w:type="dxa" w:w="1300"/>
+            <w:tcBorders>
+              <w:top w:val="single" w:color="D1D5DB" w:sz="4"/>
+              <w:left w:val="single" w:color="D1D5DB" w:sz="4"/>
+              <w:bottom w:val="single" w:color="D1D5DB" w:sz="4"/>
+              <w:right w:val="single" w:color="D1D5DB" w:sz="4"/>
+            </w:tcBorders>
+            <w:tcMar>
+              <w:top w:type="dxa" w:w="70"/>
+              <w:left w:type="dxa" w:w="110"/>
+              <w:bottom w:type="dxa" w:w="70"/>
+              <w:right w:type="dxa" w:w="110"/>
+            </w:tcMar>
+          </w:tcPr>
+          <w:p>
+            <w:pPr>
+              <w:spacing w:after="40" w:line="252"/>
+            </w:pPr>
+            <w:r>
+              <w:rPr>
+                <w:rFonts w:ascii="Menlo" w:cs="Menlo" w:eastAsia="Menlo" w:hAnsi="Menlo"/>
+                <w:color w:val="8A1538"/>
+                <w:sz w:val="15"/>
+                <w:szCs w:val="15"/>
+              </w:rPr>
+              <w:t xml:space="preserve">shared-redis</w:t>
+            </w:r>
+          </w:p>
+        </w:tc>
+        <w:tc>
+          <w:tcPr>
+            <w:tcW w:type="dxa" w:w="1400"/>
+            <w:tcBorders>
+              <w:top w:val="single" w:color="D1D5DB" w:sz="4"/>
+              <w:left w:val="single" w:color="D1D5DB" w:sz="4"/>
+              <w:bottom w:val="single" w:color="D1D5DB" w:sz="4"/>
+              <w:right w:val="single" w:color="D1D5DB" w:sz="4"/>
+            </w:tcBorders>
+            <w:tcMar>
+              <w:top w:type="dxa" w:w="70"/>
+              <w:left w:type="dxa" w:w="110"/>
+              <w:bottom w:type="dxa" w:w="70"/>
+              <w:right w:type="dxa" w:w="110"/>
+            </w:tcMar>
+          </w:tcPr>
+          <w:p>
+            <w:pPr>
+              <w:spacing w:after="40" w:line="252"/>
+            </w:pPr>
+            <w:r>
+              <w:rPr>
+                <w:rFonts w:ascii="Menlo" w:cs="Menlo" w:eastAsia="Menlo" w:hAnsi="Menlo"/>
+                <w:color w:val="8A1538"/>
+                <w:sz w:val="15"/>
+                <w:szCs w:val="15"/>
+              </w:rPr>
+              <w:t xml:space="preserve">shared-redis-acl</w:t>
+            </w:r>
+          </w:p>
+        </w:tc>
+      </w:tr>
+    </w:tbl>
+    <w:p>
+      <w:pPr>
+        <w:spacing w:after="120"/>
+      </w:pPr>
+    </w:p>
+    <w:p>
+      <w:pPr>
+        <w:pStyle w:val="ListParagraph"/>
+        <w:numPr>
+          <w:ilvl w:val="0"/>
+          <w:numId w:val="3"/>
+        </w:numPr>
+        <w:spacing w:after="80" w:line="276"/>
+      </w:pPr>
+      <w:r>
+        <w:t xml:space="preserve">Nama APM mengikuti nama Deployment: </w:t>
+      </w:r>
+      <w:r>
+        <w:rPr>
+          <w:rFonts w:ascii="Menlo" w:cs="Menlo" w:eastAsia="Menlo" w:hAnsi="Menlo"/>
+          <w:color w:val="8A1538"/>
+          <w:sz w:val="18"/>
+          <w:szCs w:val="18"/>
+        </w:rPr>
+        <w:t xml:space="preserve">ms-bribrain-nilam-ocr-orchestrator-api</w:t>
+      </w:r>
+      <w:r>
+        <w:t xml:space="preserve"> dan </w:t>
+      </w:r>
+      <w:r>
+        <w:rPr>
+          <w:rFonts w:ascii="Menlo" w:cs="Menlo" w:eastAsia="Menlo" w:hAnsi="Menlo"/>
+          <w:color w:val="8A1538"/>
+          <w:sz w:val="18"/>
+          <w:szCs w:val="18"/>
+        </w:rPr>
+        <w:t xml:space="preserve">-worker</w:t>
+      </w:r>
+      <w:r>
+        <w:t xml:space="preserve">.</w:t>
+      </w:r>
+    </w:p>
+    <w:p>
+      <w:pPr>
+        <w:pStyle w:val="ListParagraph"/>
+        <w:numPr>
+          <w:ilvl w:val="0"/>
+          <w:numId w:val="3"/>
+        </w:numPr>
+        <w:spacing w:after="80" w:line="276"/>
+      </w:pPr>
+      <w:r>
+        <w:t xml:space="preserve">Admin UI meneruskan </w:t>
+      </w:r>
+      <w:r>
+        <w:rPr>
+          <w:rFonts w:ascii="Menlo" w:cs="Menlo" w:eastAsia="Menlo" w:hAnsi="Menlo"/>
+          <w:color w:val="8A1538"/>
+          <w:sz w:val="18"/>
+          <w:szCs w:val="18"/>
+        </w:rPr>
+        <w:t xml:space="preserve">/api</w:t>
+      </w:r>
+      <w:r>
+        <w:t xml:space="preserve"> ke </w:t>
+      </w:r>
+      <w:r>
+        <w:rPr>
+          <w:rFonts w:ascii="Menlo" w:cs="Menlo" w:eastAsia="Menlo" w:hAnsi="Menlo"/>
+          <w:color w:val="8A1538"/>
+          <w:sz w:val="18"/>
+          <w:szCs w:val="18"/>
+        </w:rPr>
+        <w:t xml:space="preserve">http://ms-bribrain-nilam-ocr-orchestrator.&lt;ns-backend&gt;.svc.cluster.local</w:t>
+      </w:r>
+      <w:r>
+        <w:t xml:space="preserve">. Bila </w:t>
+      </w:r>
+      <w:r>
+        <w:rPr>
+          <w:rFonts w:ascii="Menlo" w:cs="Menlo" w:eastAsia="Menlo" w:hAnsi="Menlo"/>
+          <w:color w:val="8A1538"/>
+          <w:sz w:val="18"/>
+          <w:szCs w:val="18"/>
+        </w:rPr>
+        <w:t xml:space="preserve">fullnameOverride</w:t>
+      </w:r>
+      <w:r>
+        <w:t xml:space="preserve"> backend diganti, </w:t>
+      </w:r>
+      <w:r>
+        <w:rPr>
+          <w:rFonts w:ascii="Menlo" w:cs="Menlo" w:eastAsia="Menlo" w:hAnsi="Menlo"/>
+          <w:color w:val="8A1538"/>
+          <w:sz w:val="18"/>
+          <w:szCs w:val="18"/>
+        </w:rPr>
+        <w:t xml:space="preserve">backend.serviceName</w:t>
+      </w:r>
+      <w:r>
+        <w:t xml:space="preserve"> di values admin UI ikut diganti.</w:t>
+      </w:r>
+    </w:p>
+    <w:p>
+      <w:pPr>
+        <w:pStyle w:val="ListParagraph"/>
+        <w:numPr>
+          <w:ilvl w:val="0"/>
+          <w:numId w:val="3"/>
+        </w:numPr>
+        <w:spacing w:after="80" w:line="276"/>
+      </w:pPr>
+      <w:r>
+        <w:t xml:space="preserve">Nama release, Secret, dan container (</w:t>
+      </w:r>
+      <w:r>
+        <w:rPr>
+          <w:rFonts w:ascii="Menlo" w:cs="Menlo" w:eastAsia="Menlo" w:hAnsi="Menlo"/>
+          <w:color w:val="8A1538"/>
+          <w:sz w:val="18"/>
+          <w:szCs w:val="18"/>
+        </w:rPr>
+        <w:t xml:space="preserve">api</w:t>
+      </w:r>
+      <w:r>
+        <w:t xml:space="preserve">, </w:t>
+      </w:r>
+      <w:r>
+        <w:rPr>
+          <w:rFonts w:ascii="Menlo" w:cs="Menlo" w:eastAsia="Menlo" w:hAnsi="Menlo"/>
+          <w:color w:val="8A1538"/>
+          <w:sz w:val="18"/>
+          <w:szCs w:val="18"/>
+        </w:rPr>
+        <w:t xml:space="preserve">worker</w:t>
+      </w:r>
+      <w:r>
+        <w:t xml:space="preserve">, </w:t>
+      </w:r>
+      <w:r>
+        <w:rPr>
+          <w:rFonts w:ascii="Menlo" w:cs="Menlo" w:eastAsia="Menlo" w:hAnsi="Menlo"/>
+          <w:color w:val="8A1538"/>
+          <w:sz w:val="18"/>
+          <w:szCs w:val="18"/>
+        </w:rPr>
+        <w:t xml:space="preserve">rbac-ui</w:t>
+      </w:r>
+      <w:r>
+        <w:t xml:space="preserve">) tidak ikut konvensi ini; mengubahnya memerlukan migrasi release atau Secret.</w:t>
+      </w:r>
+    </w:p>
+    <w:p>
+      <w:pPr>
         <w:pStyle w:val="Heading1"/>
         <w:pageBreakBefore/>
       </w:pPr>
-      <w:bookmarkStart w:name="_Toc20" w:id="20"/>
+      <w:bookmarkStart w:name="_Toc21" w:id="21"/>
       <w:r>
         <w:t xml:space="preserve">5. Menyiapkan deploy host</w:t>
       </w:r>
-      <w:bookmarkEnd w:id="20"/>
+      <w:bookmarkEnd w:id="21"/>
     </w:p>
     <w:p>
       <w:pPr>
@@ -9312,11 +10350,11 @@
       <w:pPr>
         <w:pStyle w:val="Heading2"/>
       </w:pPr>
-      <w:bookmarkStart w:name="_Toc21" w:id="21"/>
+      <w:bookmarkStart w:name="_Toc22" w:id="22"/>
       <w:r>
         <w:t xml:space="preserve">5.1 Salin repo</w:t>
       </w:r>
-      <w:bookmarkEnd w:id="21"/>
+      <w:bookmarkEnd w:id="22"/>
     </w:p>
     <w:p>
       <w:pPr>
@@ -9492,11 +10530,11 @@
       <w:pPr>
         <w:pStyle w:val="Heading2"/>
       </w:pPr>
-      <w:bookmarkStart w:name="_Toc22" w:id="22"/>
+      <w:bookmarkStart w:name="_Toc23" w:id="23"/>
       <w:r>
         <w:t xml:space="preserve">5.2 Buat .env dan file environment</w:t>
       </w:r>
-      <w:bookmarkEnd w:id="22"/>
+      <w:bookmarkEnd w:id="23"/>
     </w:p>
     <w:p>
       <w:pPr>
@@ -9847,11 +10885,11 @@
       <w:pPr>
         <w:pStyle w:val="Heading2"/>
       </w:pPr>
-      <w:bookmarkStart w:name="_Toc23" w:id="23"/>
+      <w:bookmarkStart w:name="_Toc24" w:id="24"/>
       <w:r>
         <w:t xml:space="preserve">5.3 Login</w:t>
       </w:r>
-      <w:bookmarkEnd w:id="23"/>
+      <w:bookmarkEnd w:id="24"/>
     </w:p>
     <w:p>
       <w:pPr>
@@ -9920,11 +10958,11 @@
         <w:pStyle w:val="Heading1"/>
         <w:pageBreakBefore/>
       </w:pPr>
-      <w:bookmarkStart w:name="_Toc24" w:id="24"/>
+      <w:bookmarkStart w:name="_Toc25" w:id="25"/>
       <w:r>
         <w:t xml:space="preserve">6. Persiapan sekali di awal</w:t>
       </w:r>
-      <w:bookmarkEnd w:id="24"/>
+      <w:bookmarkEnd w:id="25"/>
     </w:p>
     <w:p>
       <w:pPr>
@@ -9938,11 +10976,11 @@
       <w:pPr>
         <w:pStyle w:val="Heading2"/>
       </w:pPr>
-      <w:bookmarkStart w:name="_Toc25" w:id="25"/>
+      <w:bookmarkStart w:name="_Toc26" w:id="26"/>
       <w:r>
         <w:t xml:space="preserve">6.1 Secret pull Nexus</w:t>
       </w:r>
-      <w:bookmarkEnd w:id="25"/>
+      <w:bookmarkEnd w:id="26"/>
     </w:p>
     <w:p>
       <w:pPr>
@@ -10004,11 +11042,11 @@
       <w:pPr>
         <w:pStyle w:val="Heading2"/>
       </w:pPr>
-      <w:bookmarkStart w:name="_Toc26" w:id="26"/>
+      <w:bookmarkStart w:name="_Toc27" w:id="27"/>
       <w:r>
         <w:t xml:space="preserve">6.2 Secret aplikasi ocr-orchestration</w:t>
       </w:r>
-      <w:bookmarkEnd w:id="26"/>
+      <w:bookmarkEnd w:id="27"/>
     </w:p>
     <w:p>
       <w:pPr>
@@ -10617,7 +11655,7 @@
           <w:sz w:val="17"/>
           <w:szCs w:val="17"/>
         </w:rPr>
-        <w:t xml:space="preserve">    deploy/ocr-orchestration-api deploy/ocr-orchestration-worker</w:t>
+        <w:t xml:space="preserve">    deploy/ms-bribrain-nilam-ocr-orchestrator-api deploy/ms-bribrain-nilam-ocr-orchestrator-worker</w:t>
       </w:r>
     </w:p>
     <w:p>
@@ -10645,11 +11683,11 @@
       <w:pPr>
         <w:pStyle w:val="Heading2"/>
       </w:pPr>
-      <w:bookmarkStart w:name="_Toc27" w:id="27"/>
+      <w:bookmarkStart w:name="_Toc28" w:id="28"/>
       <w:r>
         <w:t xml:space="preserve">6.3 Setup pertama di cluster shared</w:t>
       </w:r>
-      <w:bookmarkEnd w:id="27"/>
+      <w:bookmarkEnd w:id="28"/>
     </w:p>
     <w:p>
       <w:pPr>
@@ -10985,11 +12023,11 @@
       <w:pPr>
         <w:pStyle w:val="Heading2"/>
       </w:pPr>
-      <w:bookmarkStart w:name="_Toc28" w:id="28"/>
+      <w:bookmarkStart w:name="_Toc29" w:id="29"/>
       <w:r>
         <w:t xml:space="preserve">6.4 Superadmin pertama</w:t>
       </w:r>
-      <w:bookmarkEnd w:id="28"/>
+      <w:bookmarkEnd w:id="29"/>
     </w:p>
     <w:p>
       <w:pPr>
@@ -11092,7 +12130,7 @@
           <w:sz w:val="18"/>
           <w:szCs w:val="18"/>
         </w:rPr>
-        <w:t xml:space="preserve">-n nilam-ocr-orchestrator deploy/ocr-orchestration-api</w:t>
+        <w:t xml:space="preserve">-n nilam-ocr-orchestrator deploy/ms-bribrain-nilam-ocr-orchestrator-api</w:t>
       </w:r>
       <w:r>
         <w:t xml:space="preserve"> secara hardcoded. Bila </w:t>
@@ -11126,11 +12164,11 @@
       <w:pPr>
         <w:pStyle w:val="Heading2"/>
       </w:pPr>
-      <w:bookmarkStart w:name="_Toc29" w:id="29"/>
+      <w:bookmarkStart w:name="_Toc30" w:id="30"/>
       <w:r>
         <w:t xml:space="preserve">6.5 Uji koneksi Bedrock (shared)</w:t>
       </w:r>
-      <w:bookmarkEnd w:id="29"/>
+      <w:bookmarkEnd w:id="30"/>
     </w:p>
     <w:p>
       <w:pPr>
@@ -11462,21 +12500,21 @@
         <w:pStyle w:val="Heading1"/>
         <w:pageBreakBefore/>
       </w:pPr>
-      <w:bookmarkStart w:name="_Toc30" w:id="30"/>
+      <w:bookmarkStart w:name="_Toc31" w:id="31"/>
       <w:r>
         <w:t xml:space="preserve">7. Deploy rutin</w:t>
       </w:r>
-      <w:bookmarkEnd w:id="30"/>
+      <w:bookmarkEnd w:id="31"/>
     </w:p>
     <w:p>
       <w:pPr>
         <w:pStyle w:val="Heading2"/>
       </w:pPr>
-      <w:bookmarkStart w:name="_Toc31" w:id="31"/>
+      <w:bookmarkStart w:name="_Toc32" w:id="32"/>
       <w:r>
         <w:t xml:space="preserve">7.1 Checklist sebelum deploy</w:t>
       </w:r>
-      <w:bookmarkEnd w:id="31"/>
+      <w:bookmarkEnd w:id="32"/>
     </w:p>
     <w:p>
       <w:pPr>
@@ -11665,11 +12703,11 @@
       <w:pPr>
         <w:pStyle w:val="Heading2"/>
       </w:pPr>
-      <w:bookmarkStart w:name="_Toc32" w:id="32"/>
+      <w:bookmarkStart w:name="_Toc33" w:id="33"/>
       <w:r>
         <w:t xml:space="preserve">7.2 Perintah deploy</w:t>
       </w:r>
-      <w:bookmarkEnd w:id="32"/>
+      <w:bookmarkEnd w:id="33"/>
     </w:p>
     <w:p>
       <w:pPr>
@@ -11898,11 +12936,11 @@
       <w:pPr>
         <w:pStyle w:val="Heading2"/>
       </w:pPr>
-      <w:bookmarkStart w:name="_Toc33" w:id="33"/>
+      <w:bookmarkStart w:name="_Toc34" w:id="34"/>
       <w:r>
         <w:t xml:space="preserve">7.3 Yang dilakukan script</w:t>
       </w:r>
-      <w:bookmarkEnd w:id="33"/>
+      <w:bookmarkEnd w:id="34"/>
     </w:p>
     <w:p>
       <w:pPr>
@@ -12102,11 +13140,11 @@
       <w:pPr>
         <w:pStyle w:val="Heading2"/>
       </w:pPr>
-      <w:bookmarkStart w:name="_Toc34" w:id="34"/>
+      <w:bookmarkStart w:name="_Toc35" w:id="35"/>
       <w:r>
         <w:t xml:space="preserve">7.4 Catatan perilaku rollout</w:t>
       </w:r>
-      <w:bookmarkEnd w:id="34"/>
+      <w:bookmarkEnd w:id="35"/>
     </w:p>
     <w:p>
       <w:pPr>
@@ -12223,11 +13261,11 @@
       <w:pPr>
         <w:pStyle w:val="Heading2"/>
       </w:pPr>
-      <w:bookmarkStart w:name="_Toc35" w:id="35"/>
+      <w:bookmarkStart w:name="_Toc36" w:id="36"/>
       <w:r>
         <w:t xml:space="preserve">7.5 Override sekali jalan</w:t>
       </w:r>
-      <w:bookmarkEnd w:id="35"/>
+      <w:bookmarkEnd w:id="36"/>
     </w:p>
     <w:p>
       <w:pPr>
@@ -12276,11 +13314,11 @@
         <w:pStyle w:val="Heading1"/>
         <w:pageBreakBefore/>
       </w:pPr>
-      <w:bookmarkStart w:name="_Toc36" w:id="36"/>
+      <w:bookmarkStart w:name="_Toc37" w:id="37"/>
       <w:r>
         <w:t xml:space="preserve">8. Verifikasi setelah deploy</w:t>
       </w:r>
-      <w:bookmarkEnd w:id="36"/>
+      <w:bookmarkEnd w:id="37"/>
     </w:p>
     <w:p>
       <w:pPr>
@@ -12491,7 +13529,7 @@
           <w:sz w:val="17"/>
           <w:szCs w:val="17"/>
         </w:rPr>
-        <w:t xml:space="preserve">./scripts/kube.sh --env shared -- kubectl rollout status deploy/ocr-orchestration-api -n &lt;ns-backend&gt;</w:t>
+        <w:t xml:space="preserve">./scripts/kube.sh --env shared -- kubectl rollout status deploy/ms-bribrain-nilam-ocr-orchestrator-api -n &lt;ns-backend&gt;</w:t>
       </w:r>
     </w:p>
     <w:p>
@@ -12596,7 +13634,7 @@
           <w:sz w:val="17"/>
           <w:szCs w:val="17"/>
         </w:rPr>
-        <w:t xml:space="preserve">./scripts/kube.sh --env shared -- kubectl logs -n &lt;ns-backend&gt; deploy/ocr-orchestration-api --tail=100</w:t>
+        <w:t xml:space="preserve">./scripts/kube.sh --env shared -- kubectl logs -n &lt;ns-backend&gt; deploy/ms-bribrain-nilam-ocr-orchestrator-api --tail=100</w:t>
       </w:r>
     </w:p>
     <w:p>
@@ -12617,7 +13655,7 @@
           <w:sz w:val="17"/>
           <w:szCs w:val="17"/>
         </w:rPr>
-        <w:t xml:space="preserve">./scripts/kube.sh --env shared -- kubectl logs -n &lt;ns-backend&gt; deploy/ocr-orchestration-worker -f</w:t>
+        <w:t xml:space="preserve">./scripts/kube.sh --env shared -- kubectl logs -n &lt;ns-backend&gt; deploy/ms-bribrain-nilam-ocr-orchestrator-worker -f</w:t>
       </w:r>
     </w:p>
     <w:p>
@@ -12680,7 +13718,7 @@
           <w:sz w:val="17"/>
           <w:szCs w:val="17"/>
         </w:rPr>
-        <w:t xml:space="preserve">./scripts/kube.sh --env shared -- kubectl get svc ocr-admin-ui -n &lt;ns-ui&gt;</w:t>
+        <w:t xml:space="preserve">./scripts/kube.sh --env shared -- kubectl get svc mf-bribrain-nilam-ocr-admin-ui -n &lt;ns-ui&gt;</w:t>
       </w:r>
     </w:p>
     <w:p>
@@ -12750,11 +13788,11 @@
       <w:pPr>
         <w:pStyle w:val="Heading2"/>
       </w:pPr>
-      <w:bookmarkStart w:name="_Toc37" w:id="37"/>
+      <w:bookmarkStart w:name="_Toc38" w:id="38"/>
       <w:r>
         <w:t xml:space="preserve">8.1 Kriteria berhasil</w:t>
       </w:r>
-      <w:bookmarkEnd w:id="37"/>
+      <w:bookmarkEnd w:id="38"/>
     </w:p>
     <w:p>
       <w:pPr>
@@ -12935,21 +13973,21 @@
         <w:pStyle w:val="Heading1"/>
         <w:pageBreakBefore/>
       </w:pPr>
-      <w:bookmarkStart w:name="_Toc38" w:id="38"/>
+      <w:bookmarkStart w:name="_Toc39" w:id="39"/>
       <w:r>
         <w:t xml:space="preserve">9. Rollback</w:t>
       </w:r>
-      <w:bookmarkEnd w:id="38"/>
+      <w:bookmarkEnd w:id="39"/>
     </w:p>
     <w:p>
       <w:pPr>
         <w:pStyle w:val="Heading2"/>
       </w:pPr>
-      <w:bookmarkStart w:name="_Toc39" w:id="39"/>
+      <w:bookmarkStart w:name="_Toc40" w:id="40"/>
       <w:r>
         <w:t xml:space="preserve">9.1 Otomatis</w:t>
       </w:r>
-      <w:bookmarkEnd w:id="39"/>
+      <w:bookmarkEnd w:id="40"/>
     </w:p>
     <w:p>
       <w:pPr>
@@ -12999,11 +14037,11 @@
       <w:pPr>
         <w:pStyle w:val="Heading2"/>
       </w:pPr>
-      <w:bookmarkStart w:name="_Toc40" w:id="40"/>
+      <w:bookmarkStart w:name="_Toc41" w:id="41"/>
       <w:r>
         <w:t xml:space="preserve">9.2 Manual</w:t>
       </w:r>
-      <w:bookmarkEnd w:id="40"/>
+      <w:bookmarkEnd w:id="41"/>
     </w:p>
     <w:p>
       <w:pPr>
@@ -13221,11 +14259,11 @@
         <w:pStyle w:val="Heading1"/>
         <w:pageBreakBefore/>
       </w:pPr>
-      <w:bookmarkStart w:name="_Toc41" w:id="41"/>
+      <w:bookmarkStart w:name="_Toc42" w:id="42"/>
       <w:r>
         <w:t xml:space="preserve">10. Operasi Redis bersama (shared)</w:t>
       </w:r>
-      <w:bookmarkEnd w:id="41"/>
+      <w:bookmarkEnd w:id="42"/>
     </w:p>
     <w:p>
       <w:pPr>
@@ -13263,11 +14301,11 @@
       <w:pPr>
         <w:pStyle w:val="Heading2"/>
       </w:pPr>
-      <w:bookmarkStart w:name="_Toc42" w:id="42"/>
+      <w:bookmarkStart w:name="_Toc43" w:id="43"/>
       <w:r>
         <w:t xml:space="preserve">10.1 Tambah user team atau rotasi password</w:t>
       </w:r>
-      <w:bookmarkEnd w:id="42"/>
+      <w:bookmarkEnd w:id="43"/>
     </w:p>
     <w:p>
       <w:pPr>
@@ -13503,11 +14541,11 @@
       <w:pPr>
         <w:pStyle w:val="Heading2"/>
       </w:pPr>
-      <w:bookmarkStart w:name="_Toc43" w:id="43"/>
+      <w:bookmarkStart w:name="_Toc44" w:id="44"/>
       <w:r>
         <w:t xml:space="preserve">10.2 Aturan untuk team</w:t>
       </w:r>
-      <w:bookmarkEnd w:id="43"/>
+      <w:bookmarkEnd w:id="44"/>
     </w:p>
     <w:p>
       <w:pPr>
@@ -13613,21 +14651,21 @@
         <w:pStyle w:val="Heading1"/>
         <w:pageBreakBefore/>
       </w:pPr>
-      <w:bookmarkStart w:name="_Toc44" w:id="44"/>
+      <w:bookmarkStart w:name="_Toc45" w:id="45"/>
       <w:r>
         <w:t xml:space="preserve">11. Ganti target dan environment baru</w:t>
       </w:r>
-      <w:bookmarkEnd w:id="44"/>
+      <w:bookmarkEnd w:id="45"/>
     </w:p>
     <w:p>
       <w:pPr>
         <w:pStyle w:val="Heading2"/>
       </w:pPr>
-      <w:bookmarkStart w:name="_Toc45" w:id="45"/>
+      <w:bookmarkStart w:name="_Toc46" w:id="46"/>
       <w:r>
         <w:t xml:space="preserve">11.1 Ganti project, cluster, atau namespace</w:t>
       </w:r>
-      <w:bookmarkEnd w:id="45"/>
+      <w:bookmarkEnd w:id="46"/>
     </w:p>
     <w:p>
       <w:pPr>
@@ -13689,11 +14727,11 @@
       <w:pPr>
         <w:pStyle w:val="Heading2"/>
       </w:pPr>
-      <w:bookmarkStart w:name="_Toc46" w:id="46"/>
+      <w:bookmarkStart w:name="_Toc47" w:id="47"/>
       <w:r>
         <w:t xml:space="preserve">11.2 Environment baru (misalnya prd)</w:t>
       </w:r>
-      <w:bookmarkEnd w:id="46"/>
+      <w:bookmarkEnd w:id="47"/>
     </w:p>
     <w:p>
       <w:pPr>
@@ -13939,17 +14977,97 @@
         <w:pStyle w:val="Heading1"/>
         <w:pageBreakBefore/>
       </w:pPr>
-      <w:bookmarkStart w:name="_Toc47" w:id="47"/>
+      <w:bookmarkStart w:name="_Toc48" w:id="48"/>
       <w:r>
         <w:t xml:space="preserve">12. Migrasi dari chart lama</w:t>
       </w:r>
-      <w:bookmarkEnd w:id="47"/>
+      <w:bookmarkEnd w:id="48"/>
     </w:p>
     <w:p>
       <w:pPr>
         <w:spacing w:after="140" w:line="288"/>
       </w:pPr>
       <w:r>
+        <w:t xml:space="preserve">Nama objek chart ini mengikuti nama repo Bitbucket lewat </w:t>
+      </w:r>
+      <w:r>
+        <w:rPr>
+          <w:rFonts w:ascii="Menlo" w:cs="Menlo" w:eastAsia="Menlo" w:hAnsi="Menlo"/>
+          <w:color w:val="8A1538"/>
+          <w:sz w:val="18"/>
+          <w:szCs w:val="18"/>
+        </w:rPr>
+        <w:t xml:space="preserve">fullnameOverride</w:t>
+      </w:r>
+      <w:r>
+        <w:t xml:space="preserve"> di </w:t>
+      </w:r>
+      <w:r>
+        <w:rPr>
+          <w:rFonts w:ascii="Menlo" w:cs="Menlo" w:eastAsia="Menlo" w:hAnsi="Menlo"/>
+          <w:color w:val="8A1538"/>
+          <w:sz w:val="18"/>
+          <w:szCs w:val="18"/>
+        </w:rPr>
+        <w:t xml:space="preserve">environments/&lt;env&gt;/*.yaml</w:t>
+      </w:r>
+      <w:r>
+        <w:t xml:space="preserve">: backend </w:t>
+      </w:r>
+      <w:r>
+        <w:rPr>
+          <w:rFonts w:ascii="Menlo" w:cs="Menlo" w:eastAsia="Menlo" w:hAnsi="Menlo"/>
+          <w:color w:val="8A1538"/>
+          <w:sz w:val="18"/>
+          <w:szCs w:val="18"/>
+        </w:rPr>
+        <w:t xml:space="preserve">ms-bribrain-nilam-ocr-orchestrator</w:t>
+      </w:r>
+      <w:r>
+        <w:t xml:space="preserve"> (Deployment </w:t>
+      </w:r>
+      <w:r>
+        <w:rPr>
+          <w:rFonts w:ascii="Menlo" w:cs="Menlo" w:eastAsia="Menlo" w:hAnsi="Menlo"/>
+          <w:color w:val="8A1538"/>
+          <w:sz w:val="18"/>
+          <w:szCs w:val="18"/>
+        </w:rPr>
+        <w:t xml:space="preserve">-api</w:t>
+      </w:r>
+      <w:r>
+        <w:t xml:space="preserve"> dan </w:t>
+      </w:r>
+      <w:r>
+        <w:rPr>
+          <w:rFonts w:ascii="Menlo" w:cs="Menlo" w:eastAsia="Menlo" w:hAnsi="Menlo"/>
+          <w:color w:val="8A1538"/>
+          <w:sz w:val="18"/>
+          <w:szCs w:val="18"/>
+        </w:rPr>
+        <w:t xml:space="preserve">-worker</w:t>
+      </w:r>
+      <w:r>
+        <w:t xml:space="preserve">), admin UI </w:t>
+      </w:r>
+      <w:r>
+        <w:rPr>
+          <w:rFonts w:ascii="Menlo" w:cs="Menlo" w:eastAsia="Menlo" w:hAnsi="Menlo"/>
+          <w:color w:val="8A1538"/>
+          <w:sz w:val="18"/>
+          <w:szCs w:val="18"/>
+        </w:rPr>
+        <w:t xml:space="preserve">mf-bribrain-nilam-ocr-admin-ui</w:t>
+      </w:r>
+      <w:r>
+        <w:t xml:space="preserve">.</w:t>
+      </w:r>
+    </w:p>
+    <w:p>
+      <w:pPr>
+        <w:spacing w:after="140" w:line="288"/>
+      </w:pPr>
+      <w:r>
         <w:t xml:space="preserve">Chart lama (</w:t>
       </w:r>
       <w:r>
@@ -13986,7 +15104,7 @@
         <w:t xml:space="preserve">ocr-dev</w:t>
       </w:r>
       <w:r>
-        <w:t xml:space="preserve">) membuat objek dengan nama yang sama (</w:t>
+        <w:t xml:space="preserve">) memakai nama </w:t>
       </w:r>
       <w:r>
         <w:rPr>
@@ -14022,7 +15140,7 @@
         <w:t xml:space="preserve">-worker</w:t>
       </w:r>
       <w:r>
-        <w:t xml:space="preserve">, </w:t>
+        <w:t xml:space="preserve">, dan </w:t>
       </w:r>
       <w:r>
         <w:rPr>
@@ -14034,7 +15152,7 @@
         <w:t xml:space="preserve">ocr-admin-ui</w:t>
       </w:r>
       <w:r>
-        <w:t xml:space="preserve">) tetapi label selector berbeda. Helm menolak mengambil alih objek milik release lain, dan script berhenti lebih awal dengan pesan yang menyebut objeknya.</w:t>
+        <w:t xml:space="preserve">, jadi tidak bentrok. Keduanya bisa berjalan berdampingan, juga di namespace yang sama:</w:t>
       </w:r>
     </w:p>
     <w:p>
@@ -14047,14 +15165,7 @@
         <w:spacing w:after="80" w:line="276"/>
       </w:pPr>
       <w:r>
-        <w:rPr>
-          <w:b/>
-          <w:bCs/>
-        </w:rPr>
-        <w:t xml:space="preserve">Disarankan: berdampingan di namespace baru.</w:t>
-      </w:r>
-      <w:r>
-        <w:t xml:space="preserve"> Set namespace baru, salin Secret </w:t>
+        <w:t xml:space="preserve">Pastikan Secret </w:t>
       </w:r>
       <w:r>
         <w:rPr>
@@ -14066,7 +15177,7 @@
         <w:t xml:space="preserve">ocr-orchestration</w:t>
       </w:r>
       <w:r>
-        <w:t xml:space="preserve"> (ganti URL nama pendek ke FQDN namespace lama), deploy, uji, lalu pindahkan konsumen ke IP LoadBalancer baru dan hapus Deployment/Service lama. Tanpa downtime.</w:t>
+        <w:t xml:space="preserve"> ada di namespace tujuan (salin dari namespace lama bila perlu, dan ganti URL nama pendek ke FQDN).</w:t>
       </w:r>
     </w:p>
     <w:p>
@@ -14079,38 +15190,102 @@
         <w:spacing w:after="80" w:line="276"/>
       </w:pPr>
       <w:r>
+        <w:t xml:space="preserve">Deploy backend dan UI baru, lalu uji (Bab 8).</w:t>
+      </w:r>
+    </w:p>
+    <w:p>
+      <w:pPr>
+        <w:pStyle w:val="ListParagraph"/>
+        <w:numPr>
+          <w:ilvl w:val="0"/>
+          <w:numId w:val="9"/>
+        </w:numPr>
+        <w:spacing w:after="80" w:line="276"/>
+      </w:pPr>
+      <w:r>
+        <w:t xml:space="preserve">Pindahkan konsumen ke Service atau IP LoadBalancer baru.</w:t>
+      </w:r>
+    </w:p>
+    <w:p>
+      <w:pPr>
+        <w:pStyle w:val="ListParagraph"/>
+        <w:numPr>
+          <w:ilvl w:val="0"/>
+          <w:numId w:val="9"/>
+        </w:numPr>
+        <w:spacing w:after="80" w:line="276"/>
+      </w:pPr>
+      <w:r>
+        <w:t xml:space="preserve">Hapus Deployment, Service, dan HPA lama milik release </w:t>
+      </w:r>
+      <w:r>
+        <w:rPr>
+          <w:rFonts w:ascii="Menlo" w:cs="Menlo" w:eastAsia="Menlo" w:hAnsi="Menlo"/>
+          <w:color w:val="8A1538"/>
+          <w:sz w:val="18"/>
+          <w:szCs w:val="18"/>
+        </w:rPr>
+        <w:t xml:space="preserve">ocr-dev</w:t>
+      </w:r>
+      <w:r>
+        <w:t xml:space="preserve">. Jangan </w:t>
+      </w:r>
+      <w:r>
+        <w:rPr>
+          <w:rFonts w:ascii="Menlo" w:cs="Menlo" w:eastAsia="Menlo" w:hAnsi="Menlo"/>
+          <w:color w:val="8A1538"/>
+          <w:sz w:val="18"/>
+          <w:szCs w:val="18"/>
+        </w:rPr>
+        <w:t xml:space="preserve">helm uninstall ocr-dev</w:t>
+      </w:r>
+      <w:r>
+        <w:t xml:space="preserve">, karena itu juga menghapus MinIO.</w:t>
+      </w:r>
+    </w:p>
+    <w:p>
+      <w:pPr>
+        <w:pBdr>
+          <w:left w:val="single" w:color="D97706" w:sz="24" w:space="8"/>
+        </w:pBdr>
+        <w:shd w:fill="FFF7E6" w:color="auto" w:val="clear"/>
+        <w:spacing w:after="200" w:before="80" w:line="276"/>
+        <w:ind w:left="160"/>
+      </w:pPr>
+      <w:r>
         <w:rPr>
           <w:b/>
           <w:bCs/>
-        </w:rPr>
-        <w:t xml:space="preserve">Namespace yang sama.</w:t>
-      </w:r>
-      <w:r>
-        <w:t xml:space="preserve"> Hapus dulu Deployment, Service, dan HPA lama milik release </w:t>
-      </w:r>
-      <w:r>
-        <w:rPr>
-          <w:rFonts w:ascii="Menlo" w:cs="Menlo" w:eastAsia="Menlo" w:hAnsi="Menlo"/>
-          <w:color w:val="8A1538"/>
-          <w:sz w:val="18"/>
-          <w:szCs w:val="18"/>
-        </w:rPr>
-        <w:t xml:space="preserve">ocr-dev</w:t>
-      </w:r>
-      <w:r>
-        <w:t xml:space="preserve">. Jangan </w:t>
-      </w:r>
-      <w:r>
-        <w:rPr>
-          <w:rFonts w:ascii="Menlo" w:cs="Menlo" w:eastAsia="Menlo" w:hAnsi="Menlo"/>
-          <w:color w:val="8A1538"/>
-          <w:sz w:val="18"/>
-          <w:szCs w:val="18"/>
-        </w:rPr>
-        <w:t xml:space="preserve">helm uninstall ocr-dev</w:t>
-      </w:r>
-      <w:r>
-        <w:t xml:space="preserve">, karena itu juga menghapus MinIO. Ada downtime, dan IP LoadBalancer berubah kecuali memakai IP statis (</w:t>
+          <w:color w:val="D97706"/>
+        </w:rPr>
+        <w:t xml:space="preserve">Penting: </w:t>
+      </w:r>
+      <w:r>
+        <w:t xml:space="preserve">Release chart ini yang masih memakai nama lama (</w:t>
+      </w:r>
+      <w:r>
+        <w:rPr>
+          <w:rFonts w:ascii="Menlo" w:cs="Menlo" w:eastAsia="Menlo" w:hAnsi="Menlo"/>
+          <w:color w:val="8A1538"/>
+          <w:sz w:val="18"/>
+          <w:szCs w:val="18"/>
+        </w:rPr>
+        <w:t xml:space="preserve">ocr-orchestration</w:t>
+      </w:r>
+      <w:r>
+        <w:t xml:space="preserve">, </w:t>
+      </w:r>
+      <w:r>
+        <w:rPr>
+          <w:rFonts w:ascii="Menlo" w:cs="Menlo" w:eastAsia="Menlo" w:hAnsi="Menlo"/>
+          <w:color w:val="8A1538"/>
+          <w:sz w:val="18"/>
+          <w:szCs w:val="18"/>
+        </w:rPr>
+        <w:t xml:space="preserve">ocr-admin-ui</w:t>
+      </w:r>
+      <w:r>
+        <w:t xml:space="preserve">) ikut berganti nama pada deploy berikutnya: Helm membuat objek baru dan menghapus yang lama. FQDN Service backend dan IP LoadBalancer berubah kecuali memakai IP statis (</w:t>
       </w:r>
       <w:r>
         <w:rPr>
@@ -14122,7 +15297,7 @@
         <w:t xml:space="preserve">service.loadBalancerIP</w:t>
       </w:r>
       <w:r>
-        <w:t xml:space="preserve">).</w:t>
+        <w:t xml:space="preserve">), jadi beri tahu konsumen sebelum deploy.</w:t>
       </w:r>
     </w:p>
     <w:p>
@@ -14130,11 +15305,11 @@
         <w:pStyle w:val="Heading1"/>
         <w:pageBreakBefore/>
       </w:pPr>
-      <w:bookmarkStart w:name="_Toc48" w:id="48"/>
+      <w:bookmarkStart w:name="_Toc49" w:id="49"/>
       <w:r>
         <w:t xml:space="preserve">13. Troubleshooting</w:t>
       </w:r>
-      <w:bookmarkEnd w:id="48"/>
+      <w:bookmarkEnd w:id="49"/>
     </w:p>
     <w:tbl>
       <w:tblPr>
@@ -16369,11 +17544,11 @@
       <w:pPr>
         <w:pStyle w:val="Heading2"/>
       </w:pPr>
-      <w:bookmarkStart w:name="_Toc49" w:id="49"/>
+      <w:bookmarkStart w:name="_Toc50" w:id="50"/>
       <w:r>
         <w:t xml:space="preserve">13.1 Perintah diagnosis</w:t>
       </w:r>
-      <w:bookmarkEnd w:id="49"/>
+      <w:bookmarkEnd w:id="50"/>
     </w:p>
     <w:p>
       <w:pPr>
@@ -16464,11 +17639,11 @@
         <w:pStyle w:val="Heading1"/>
         <w:pageBreakBefore/>
       </w:pPr>
-      <w:bookmarkStart w:name="_Toc50" w:id="50"/>
+      <w:bookmarkStart w:name="_Toc51" w:id="51"/>
       <w:r>
         <w:t xml:space="preserve">14. Menambah service baru</w:t>
       </w:r>
-      <w:bookmarkEnd w:id="50"/>
+      <w:bookmarkEnd w:id="51"/>
     </w:p>
     <w:p>
       <w:pPr>
@@ -16517,7 +17692,19 @@
         <w:t xml:space="preserve">environments/&lt;env&gt;/&lt;service&gt;.yaml</w:t>
       </w:r>
       <w:r>
-        <w:t xml:space="preserve"> untuk setiap environment.</w:t>
+        <w:t xml:space="preserve"> untuk setiap environment, dengan </w:t>
+      </w:r>
+      <w:r>
+        <w:rPr>
+          <w:rFonts w:ascii="Menlo" w:cs="Menlo" w:eastAsia="Menlo" w:hAnsi="Menlo"/>
+          <w:color w:val="8A1538"/>
+          <w:sz w:val="18"/>
+          <w:szCs w:val="18"/>
+        </w:rPr>
+        <w:t xml:space="preserve">fullnameOverride</w:t>
+      </w:r>
+      <w:r>
+        <w:t xml:space="preserve"> = nama repo Bitbucket service (Bagian 4.5).</w:t>
       </w:r>
     </w:p>
     <w:p>
@@ -16702,11 +17889,11 @@
       <w:pPr>
         <w:pStyle w:val="Heading2"/>
       </w:pPr>
-      <w:bookmarkStart w:name="_Toc51" w:id="51"/>
+      <w:bookmarkStart w:name="_Toc52" w:id="52"/>
       <w:r>
         <w:t xml:space="preserve">14.1 Standar</w:t>
       </w:r>
-      <w:bookmarkEnd w:id="51"/>
+      <w:bookmarkEnd w:id="52"/>
     </w:p>
     <w:p>
       <w:pPr>
@@ -16731,19 +17918,19 @@
         <w:spacing w:after="80" w:line="276"/>
       </w:pPr>
       <w:r>
-        <w:t xml:space="preserve">Label </w:t>
-      </w:r>
-      <w:r>
-        <w:rPr>
-          <w:rFonts w:ascii="Menlo" w:cs="Menlo" w:eastAsia="Menlo" w:hAnsi="Menlo"/>
-          <w:color w:val="8A1538"/>
-          <w:sz w:val="18"/>
-          <w:szCs w:val="18"/>
-        </w:rPr>
-        <w:t xml:space="preserve">app.kubernetes.io/{name,instance,component,version,part-of}</w:t>
-      </w:r>
-      <w:r>
-        <w:t xml:space="preserve">; selector hanya name, instance, component.</w:t>
+        <w:t xml:space="preserve">Nama repo Bitbucket = nama image Nexus = </w:t>
+      </w:r>
+      <w:r>
+        <w:rPr>
+          <w:rFonts w:ascii="Menlo" w:cs="Menlo" w:eastAsia="Menlo" w:hAnsi="Menlo"/>
+          <w:color w:val="8A1538"/>
+          <w:sz w:val="18"/>
+          <w:szCs w:val="18"/>
+        </w:rPr>
+        <w:t xml:space="preserve">fullnameOverride</w:t>
+      </w:r>
+      <w:r>
+        <w:t xml:space="preserve">.</w:t>
       </w:r>
     </w:p>
     <w:p>
@@ -16756,19 +17943,19 @@
         <w:spacing w:after="80" w:line="276"/>
       </w:pPr>
       <w:r>
-        <w:t xml:space="preserve">Image dari Nexus dengan tag SHA yang immutable dan </w:t>
-      </w:r>
-      <w:r>
-        <w:rPr>
-          <w:rFonts w:ascii="Menlo" w:cs="Menlo" w:eastAsia="Menlo" w:hAnsi="Menlo"/>
-          <w:color w:val="8A1538"/>
-          <w:sz w:val="18"/>
-          <w:szCs w:val="18"/>
-        </w:rPr>
-        <w:t xml:space="preserve">pullPolicy: IfNotPresent</w:t>
-      </w:r>
-      <w:r>
-        <w:t xml:space="preserve">.</w:t>
+        <w:t xml:space="preserve">Label </w:t>
+      </w:r>
+      <w:r>
+        <w:rPr>
+          <w:rFonts w:ascii="Menlo" w:cs="Menlo" w:eastAsia="Menlo" w:hAnsi="Menlo"/>
+          <w:color w:val="8A1538"/>
+          <w:sz w:val="18"/>
+          <w:szCs w:val="18"/>
+        </w:rPr>
+        <w:t xml:space="preserve">app.kubernetes.io/{name,instance,component,version,part-of}</w:t>
+      </w:r>
+      <w:r>
+        <w:t xml:space="preserve">; selector hanya name, instance, component.</w:t>
       </w:r>
     </w:p>
     <w:p>
@@ -16781,19 +17968,19 @@
         <w:spacing w:after="80" w:line="276"/>
       </w:pPr>
       <w:r>
-        <w:t xml:space="preserve">Rahasia di Secret yang dibuat di luar chart (</w:t>
-      </w:r>
-      <w:r>
-        <w:rPr>
-          <w:rFonts w:ascii="Menlo" w:cs="Menlo" w:eastAsia="Menlo" w:hAnsi="Menlo"/>
-          <w:color w:val="8A1538"/>
-          <w:sz w:val="18"/>
-          <w:szCs w:val="18"/>
-        </w:rPr>
-        <w:t xml:space="preserve">existingSecret</w:t>
-      </w:r>
-      <w:r>
-        <w:t xml:space="preserve">), tidak pernah di values.</w:t>
+        <w:t xml:space="preserve">Image dari Nexus dengan tag SHA yang immutable dan </w:t>
+      </w:r>
+      <w:r>
+        <w:rPr>
+          <w:rFonts w:ascii="Menlo" w:cs="Menlo" w:eastAsia="Menlo" w:hAnsi="Menlo"/>
+          <w:color w:val="8A1538"/>
+          <w:sz w:val="18"/>
+          <w:szCs w:val="18"/>
+        </w:rPr>
+        <w:t xml:space="preserve">pullPolicy: IfNotPresent</w:t>
+      </w:r>
+      <w:r>
+        <w:t xml:space="preserve">.</w:t>
       </w:r>
     </w:p>
     <w:p>
@@ -16806,7 +17993,19 @@
         <w:spacing w:after="80" w:line="276"/>
       </w:pPr>
       <w:r>
-        <w:t xml:space="preserve">Readiness memeriksa dependensi; liveness hanya proses itu sendiri, supaya gangguan database tidak memicu restart massal.</w:t>
+        <w:t xml:space="preserve">Rahasia di Secret yang dibuat di luar chart (</w:t>
+      </w:r>
+      <w:r>
+        <w:rPr>
+          <w:rFonts w:ascii="Menlo" w:cs="Menlo" w:eastAsia="Menlo" w:hAnsi="Menlo"/>
+          <w:color w:val="8A1538"/>
+          <w:sz w:val="18"/>
+          <w:szCs w:val="18"/>
+        </w:rPr>
+        <w:t xml:space="preserve">existingSecret</w:t>
+      </w:r>
+      <w:r>
+        <w:t xml:space="preserve">), tidak pernah di values.</w:t>
       </w:r>
     </w:p>
     <w:p>
@@ -16819,31 +18018,7 @@
         <w:spacing w:after="80" w:line="276"/>
       </w:pPr>
       <w:r>
-        <w:t xml:space="preserve">Tanpa CPU limit (throttling merusak latensi), memory limit tetap ada; HPA tanpa </w:t>
-      </w:r>
-      <w:r>
-        <w:rPr>
-          <w:rFonts w:ascii="Menlo" w:cs="Menlo" w:eastAsia="Menlo" w:hAnsi="Menlo"/>
-          <w:color w:val="8A1538"/>
-          <w:sz w:val="18"/>
-          <w:szCs w:val="18"/>
-        </w:rPr>
-        <w:t xml:space="preserve">replicas</w:t>
-      </w:r>
-      <w:r>
-        <w:t xml:space="preserve"> di Deployment; PDB </w:t>
-      </w:r>
-      <w:r>
-        <w:rPr>
-          <w:rFonts w:ascii="Menlo" w:cs="Menlo" w:eastAsia="Menlo" w:hAnsi="Menlo"/>
-          <w:color w:val="8A1538"/>
-          <w:sz w:val="18"/>
-          <w:szCs w:val="18"/>
-        </w:rPr>
-        <w:t xml:space="preserve">maxUnavailable</w:t>
-      </w:r>
-      <w:r>
-        <w:t xml:space="preserve">.</w:t>
+        <w:t xml:space="preserve">Readiness memeriksa dependensi; liveness hanya proses itu sendiri, supaya gangguan database tidak memicu restart massal.</w:t>
       </w:r>
     </w:p>
     <w:p>
@@ -16856,37 +18031,28 @@
         <w:spacing w:after="80" w:line="276"/>
       </w:pPr>
       <w:r>
-        <w:rPr>
-          <w:rFonts w:ascii="Menlo" w:cs="Menlo" w:eastAsia="Menlo" w:hAnsi="Menlo"/>
-          <w:color w:val="8A1538"/>
-          <w:sz w:val="18"/>
-          <w:szCs w:val="18"/>
-        </w:rPr>
-        <w:t xml:space="preserve">runAsNonRoot</w:t>
-      </w:r>
-      <w:r>
-        <w:t xml:space="preserve"> dengan UID numerik, </w:t>
-      </w:r>
-      <w:r>
-        <w:rPr>
-          <w:rFonts w:ascii="Menlo" w:cs="Menlo" w:eastAsia="Menlo" w:hAnsi="Menlo"/>
-          <w:color w:val="8A1538"/>
-          <w:sz w:val="18"/>
-          <w:szCs w:val="18"/>
-        </w:rPr>
-        <w:t xml:space="preserve">seccompProfile: RuntimeDefault</w:t>
-      </w:r>
-      <w:r>
-        <w:t xml:space="preserve">, drop semua capability, </w:t>
-      </w:r>
-      <w:r>
-        <w:rPr>
-          <w:rFonts w:ascii="Menlo" w:cs="Menlo" w:eastAsia="Menlo" w:hAnsi="Menlo"/>
-          <w:color w:val="8A1538"/>
-          <w:sz w:val="18"/>
-          <w:szCs w:val="18"/>
-        </w:rPr>
-        <w:t xml:space="preserve">automountServiceAccountToken: false</w:t>
+        <w:t xml:space="preserve">Tanpa CPU limit (throttling merusak latensi), memory limit tetap ada; HPA tanpa </w:t>
+      </w:r>
+      <w:r>
+        <w:rPr>
+          <w:rFonts w:ascii="Menlo" w:cs="Menlo" w:eastAsia="Menlo" w:hAnsi="Menlo"/>
+          <w:color w:val="8A1538"/>
+          <w:sz w:val="18"/>
+          <w:szCs w:val="18"/>
+        </w:rPr>
+        <w:t xml:space="preserve">replicas</w:t>
+      </w:r>
+      <w:r>
+        <w:t xml:space="preserve"> di Deployment; PDB </w:t>
+      </w:r>
+      <w:r>
+        <w:rPr>
+          <w:rFonts w:ascii="Menlo" w:cs="Menlo" w:eastAsia="Menlo" w:hAnsi="Menlo"/>
+          <w:color w:val="8A1538"/>
+          <w:sz w:val="18"/>
+          <w:szCs w:val="18"/>
+        </w:rPr>
+        <w:t xml:space="preserve">maxUnavailable</w:t>
       </w:r>
       <w:r>
         <w:t xml:space="preserve">.</w:t>
@@ -16902,43 +18068,41 @@
         <w:spacing w:after="80" w:line="276"/>
       </w:pPr>
       <w:r>
-        <w:t xml:space="preserve">Script: tag wajib, cek image sebelum deploy, </w:t>
-      </w:r>
-      <w:r>
-        <w:rPr>
-          <w:rFonts w:ascii="Menlo" w:cs="Menlo" w:eastAsia="Menlo" w:hAnsi="Menlo"/>
-          <w:color w:val="8A1538"/>
-          <w:sz w:val="18"/>
-          <w:szCs w:val="18"/>
-        </w:rPr>
-        <w:t xml:space="preserve">--wait</w:t>
-      </w:r>
-      <w:r>
-        <w:t xml:space="preserve"> dengan rollback otomatis, </w:t>
-      </w:r>
-      <w:r>
-        <w:rPr>
-          <w:rFonts w:ascii="Menlo" w:cs="Menlo" w:eastAsia="Menlo" w:hAnsi="Menlo"/>
-          <w:color w:val="8A1538"/>
-          <w:sz w:val="18"/>
-          <w:szCs w:val="18"/>
-        </w:rPr>
-        <w:t xml:space="preserve">--dry-run</w:t>
-      </w:r>
-      <w:r>
-        <w:t xml:space="preserve"> tanpa cluster.</w:t>
-      </w:r>
-    </w:p>
-    <w:p>
-      <w:pPr>
-        <w:pStyle w:val="Heading1"/>
-        <w:pageBreakBefore/>
-      </w:pPr>
-      <w:bookmarkStart w:name="_Toc52" w:id="52"/>
-      <w:r>
-        <w:t xml:space="preserve">15. Aturan keamanan dan rahasia</w:t>
-      </w:r>
-      <w:bookmarkEnd w:id="52"/>
+        <w:rPr>
+          <w:rFonts w:ascii="Menlo" w:cs="Menlo" w:eastAsia="Menlo" w:hAnsi="Menlo"/>
+          <w:color w:val="8A1538"/>
+          <w:sz w:val="18"/>
+          <w:szCs w:val="18"/>
+        </w:rPr>
+        <w:t xml:space="preserve">runAsNonRoot</w:t>
+      </w:r>
+      <w:r>
+        <w:t xml:space="preserve"> dengan UID numerik, </w:t>
+      </w:r>
+      <w:r>
+        <w:rPr>
+          <w:rFonts w:ascii="Menlo" w:cs="Menlo" w:eastAsia="Menlo" w:hAnsi="Menlo"/>
+          <w:color w:val="8A1538"/>
+          <w:sz w:val="18"/>
+          <w:szCs w:val="18"/>
+        </w:rPr>
+        <w:t xml:space="preserve">seccompProfile: RuntimeDefault</w:t>
+      </w:r>
+      <w:r>
+        <w:t xml:space="preserve">, drop semua capability, </w:t>
+      </w:r>
+      <w:r>
+        <w:rPr>
+          <w:rFonts w:ascii="Menlo" w:cs="Menlo" w:eastAsia="Menlo" w:hAnsi="Menlo"/>
+          <w:color w:val="8A1538"/>
+          <w:sz w:val="18"/>
+          <w:szCs w:val="18"/>
+        </w:rPr>
+        <w:t xml:space="preserve">automountServiceAccountToken: false</w:t>
+      </w:r>
+      <w:r>
+        <w:t xml:space="preserve">.</w:t>
+      </w:r>
     </w:p>
     <w:p>
       <w:pPr>
@@ -16950,29 +18114,43 @@
         <w:spacing w:after="80" w:line="276"/>
       </w:pPr>
       <w:r>
-        <w:rPr>
-          <w:rFonts w:ascii="Menlo" w:cs="Menlo" w:eastAsia="Menlo" w:hAnsi="Menlo"/>
-          <w:color w:val="8A1538"/>
-          <w:sz w:val="18"/>
-          <w:szCs w:val="18"/>
-        </w:rPr>
-        <w:t xml:space="preserve">.env</w:t>
-      </w:r>
-      <w:r>
-        <w:t xml:space="preserve"> tidak pernah di-commit dan tidak dikirim lewat SCP; buat langsung di host dari </w:t>
-      </w:r>
-      <w:r>
-        <w:rPr>
-          <w:rFonts w:ascii="Menlo" w:cs="Menlo" w:eastAsia="Menlo" w:hAnsi="Menlo"/>
-          <w:color w:val="8A1538"/>
-          <w:sz w:val="18"/>
-          <w:szCs w:val="18"/>
-        </w:rPr>
-        <w:t xml:space="preserve">.env.example</w:t>
-      </w:r>
-      <w:r>
-        <w:t xml:space="preserve">.</w:t>
-      </w:r>
+        <w:t xml:space="preserve">Script: tag wajib, cek image sebelum deploy, </w:t>
+      </w:r>
+      <w:r>
+        <w:rPr>
+          <w:rFonts w:ascii="Menlo" w:cs="Menlo" w:eastAsia="Menlo" w:hAnsi="Menlo"/>
+          <w:color w:val="8A1538"/>
+          <w:sz w:val="18"/>
+          <w:szCs w:val="18"/>
+        </w:rPr>
+        <w:t xml:space="preserve">--wait</w:t>
+      </w:r>
+      <w:r>
+        <w:t xml:space="preserve"> dengan rollback otomatis, </w:t>
+      </w:r>
+      <w:r>
+        <w:rPr>
+          <w:rFonts w:ascii="Menlo" w:cs="Menlo" w:eastAsia="Menlo" w:hAnsi="Menlo"/>
+          <w:color w:val="8A1538"/>
+          <w:sz w:val="18"/>
+          <w:szCs w:val="18"/>
+        </w:rPr>
+        <w:t xml:space="preserve">--dry-run</w:t>
+      </w:r>
+      <w:r>
+        <w:t xml:space="preserve"> tanpa cluster.</w:t>
+      </w:r>
+    </w:p>
+    <w:p>
+      <w:pPr>
+        <w:pStyle w:val="Heading1"/>
+        <w:pageBreakBefore/>
+      </w:pPr>
+      <w:bookmarkStart w:name="_Toc53" w:id="53"/>
+      <w:r>
+        <w:t xml:space="preserve">15. Aturan keamanan dan rahasia</w:t>
+      </w:r>
+      <w:bookmarkEnd w:id="53"/>
     </w:p>
     <w:p>
       <w:pPr>
@@ -16984,19 +18162,28 @@
         <w:spacing w:after="80" w:line="276"/>
       </w:pPr>
       <w:r>
-        <w:t xml:space="preserve">Rahasia tidak pernah ditaruh di </w:t>
-      </w:r>
-      <w:r>
-        <w:rPr>
-          <w:rFonts w:ascii="Menlo" w:cs="Menlo" w:eastAsia="Menlo" w:hAnsi="Menlo"/>
-          <w:color w:val="8A1538"/>
-          <w:sz w:val="18"/>
-          <w:szCs w:val="18"/>
-        </w:rPr>
-        <w:t xml:space="preserve">environments/*.env</w:t>
-      </w:r>
-      <w:r>
-        <w:t xml:space="preserve"> atau values Helm.</w:t>
+        <w:rPr>
+          <w:rFonts w:ascii="Menlo" w:cs="Menlo" w:eastAsia="Menlo" w:hAnsi="Menlo"/>
+          <w:color w:val="8A1538"/>
+          <w:sz w:val="18"/>
+          <w:szCs w:val="18"/>
+        </w:rPr>
+        <w:t xml:space="preserve">.env</w:t>
+      </w:r>
+      <w:r>
+        <w:t xml:space="preserve"> tidak pernah di-commit dan tidak dikirim lewat SCP; buat langsung di host dari </w:t>
+      </w:r>
+      <w:r>
+        <w:rPr>
+          <w:rFonts w:ascii="Menlo" w:cs="Menlo" w:eastAsia="Menlo" w:hAnsi="Menlo"/>
+          <w:color w:val="8A1538"/>
+          <w:sz w:val="18"/>
+          <w:szCs w:val="18"/>
+        </w:rPr>
+        <w:t xml:space="preserve">.env.example</w:t>
+      </w:r>
+      <w:r>
+        <w:t xml:space="preserve">.</w:t>
       </w:r>
     </w:p>
     <w:p>
@@ -17009,28 +18196,19 @@
         <w:spacing w:after="80" w:line="276"/>
       </w:pPr>
       <w:r>
-        <w:rPr>
-          <w:rFonts w:ascii="Menlo" w:cs="Menlo" w:eastAsia="Menlo" w:hAnsi="Menlo"/>
-          <w:color w:val="8A1538"/>
-          <w:sz w:val="18"/>
-          <w:szCs w:val="18"/>
-        </w:rPr>
-        <w:t xml:space="preserve">environments/&lt;env&gt;.env</w:t>
-      </w:r>
-      <w:r>
-        <w:t xml:space="preserve"> (project, cluster, bastion, host Nexus) juga di-ignore; yang di-commit hanya template </w:t>
-      </w:r>
-      <w:r>
-        <w:rPr>
-          <w:rFonts w:ascii="Menlo" w:cs="Menlo" w:eastAsia="Menlo" w:hAnsi="Menlo"/>
-          <w:color w:val="8A1538"/>
-          <w:sz w:val="18"/>
-          <w:szCs w:val="18"/>
-        </w:rPr>
-        <w:t xml:space="preserve">.env.example</w:t>
-      </w:r>
-      <w:r>
-        <w:t xml:space="preserve"> dengan placeholder.</w:t>
+        <w:t xml:space="preserve">Rahasia tidak pernah ditaruh di </w:t>
+      </w:r>
+      <w:r>
+        <w:rPr>
+          <w:rFonts w:ascii="Menlo" w:cs="Menlo" w:eastAsia="Menlo" w:hAnsi="Menlo"/>
+          <w:color w:val="8A1538"/>
+          <w:sz w:val="18"/>
+          <w:szCs w:val="18"/>
+        </w:rPr>
+        <w:t xml:space="preserve">environments/*.env</w:t>
+      </w:r>
+      <w:r>
+        <w:t xml:space="preserve"> atau values Helm.</w:t>
       </w:r>
     </w:p>
     <w:p>
@@ -17043,43 +18221,28 @@
         <w:spacing w:after="80" w:line="276"/>
       </w:pPr>
       <w:r>
-        <w:t xml:space="preserve">Buat Secret dari file (</w:t>
-      </w:r>
-      <w:r>
-        <w:rPr>
-          <w:rFonts w:ascii="Menlo" w:cs="Menlo" w:eastAsia="Menlo" w:hAnsi="Menlo"/>
-          <w:color w:val="8A1538"/>
-          <w:sz w:val="18"/>
-          <w:szCs w:val="18"/>
-        </w:rPr>
-        <w:t xml:space="preserve">--from-env-file</w:t>
-      </w:r>
-      <w:r>
-        <w:t xml:space="preserve">, </w:t>
-      </w:r>
-      <w:r>
-        <w:rPr>
-          <w:rFonts w:ascii="Menlo" w:cs="Menlo" w:eastAsia="Menlo" w:hAnsi="Menlo"/>
-          <w:color w:val="8A1538"/>
-          <w:sz w:val="18"/>
-          <w:szCs w:val="18"/>
-        </w:rPr>
-        <w:t xml:space="preserve">--from-file</w:t>
-      </w:r>
-      <w:r>
-        <w:t xml:space="preserve">), bukan dari argumen shell yang terlihat di </w:t>
-      </w:r>
-      <w:r>
-        <w:rPr>
-          <w:rFonts w:ascii="Menlo" w:cs="Menlo" w:eastAsia="Menlo" w:hAnsi="Menlo"/>
-          <w:color w:val="8A1538"/>
-          <w:sz w:val="18"/>
-          <w:szCs w:val="18"/>
-        </w:rPr>
-        <w:t xml:space="preserve">ps</w:t>
-      </w:r>
-      <w:r>
-        <w:t xml:space="preserve"> dan riwayat shell.</w:t>
+        <w:rPr>
+          <w:rFonts w:ascii="Menlo" w:cs="Menlo" w:eastAsia="Menlo" w:hAnsi="Menlo"/>
+          <w:color w:val="8A1538"/>
+          <w:sz w:val="18"/>
+          <w:szCs w:val="18"/>
+        </w:rPr>
+        <w:t xml:space="preserve">environments/&lt;env&gt;.env</w:t>
+      </w:r>
+      <w:r>
+        <w:t xml:space="preserve"> (project, cluster, bastion, host Nexus) juga di-ignore; yang di-commit hanya template </w:t>
+      </w:r>
+      <w:r>
+        <w:rPr>
+          <w:rFonts w:ascii="Menlo" w:cs="Menlo" w:eastAsia="Menlo" w:hAnsi="Menlo"/>
+          <w:color w:val="8A1538"/>
+          <w:sz w:val="18"/>
+          <w:szCs w:val="18"/>
+        </w:rPr>
+        <w:t xml:space="preserve">.env.example</w:t>
+      </w:r>
+      <w:r>
+        <w:t xml:space="preserve"> dengan placeholder.</w:t>
       </w:r>
     </w:p>
     <w:p>
@@ -17092,19 +18255,43 @@
         <w:spacing w:after="80" w:line="276"/>
       </w:pPr>
       <w:r>
-        <w:t xml:space="preserve">File rahasia sementara di-</w:t>
-      </w:r>
-      <w:r>
-        <w:rPr>
-          <w:rFonts w:ascii="Menlo" w:cs="Menlo" w:eastAsia="Menlo" w:hAnsi="Menlo"/>
-          <w:color w:val="8A1538"/>
-          <w:sz w:val="18"/>
-          <w:szCs w:val="18"/>
-        </w:rPr>
-        <w:t xml:space="preserve">chmod 600</w:t>
-      </w:r>
-      <w:r>
-        <w:t xml:space="preserve"> dan dihapus setelah dipakai.</w:t>
+        <w:t xml:space="preserve">Buat Secret dari file (</w:t>
+      </w:r>
+      <w:r>
+        <w:rPr>
+          <w:rFonts w:ascii="Menlo" w:cs="Menlo" w:eastAsia="Menlo" w:hAnsi="Menlo"/>
+          <w:color w:val="8A1538"/>
+          <w:sz w:val="18"/>
+          <w:szCs w:val="18"/>
+        </w:rPr>
+        <w:t xml:space="preserve">--from-env-file</w:t>
+      </w:r>
+      <w:r>
+        <w:t xml:space="preserve">, </w:t>
+      </w:r>
+      <w:r>
+        <w:rPr>
+          <w:rFonts w:ascii="Menlo" w:cs="Menlo" w:eastAsia="Menlo" w:hAnsi="Menlo"/>
+          <w:color w:val="8A1538"/>
+          <w:sz w:val="18"/>
+          <w:szCs w:val="18"/>
+        </w:rPr>
+        <w:t xml:space="preserve">--from-file</w:t>
+      </w:r>
+      <w:r>
+        <w:t xml:space="preserve">), bukan dari argumen shell yang terlihat di </w:t>
+      </w:r>
+      <w:r>
+        <w:rPr>
+          <w:rFonts w:ascii="Menlo" w:cs="Menlo" w:eastAsia="Menlo" w:hAnsi="Menlo"/>
+          <w:color w:val="8A1538"/>
+          <w:sz w:val="18"/>
+          <w:szCs w:val="18"/>
+        </w:rPr>
+        <w:t xml:space="preserve">ps</w:t>
+      </w:r>
+      <w:r>
+        <w:t xml:space="preserve"> dan riwayat shell.</w:t>
       </w:r>
     </w:p>
     <w:p>
@@ -17117,7 +18304,19 @@
         <w:spacing w:after="80" w:line="276"/>
       </w:pPr>
       <w:r>
-        <w:t xml:space="preserve">Pakai akun service Nexus, bukan akun pribadi.</w:t>
+        <w:t xml:space="preserve">File rahasia sementara di-</w:t>
+      </w:r>
+      <w:r>
+        <w:rPr>
+          <w:rFonts w:ascii="Menlo" w:cs="Menlo" w:eastAsia="Menlo" w:hAnsi="Menlo"/>
+          <w:color w:val="8A1538"/>
+          <w:sz w:val="18"/>
+          <w:szCs w:val="18"/>
+        </w:rPr>
+        <w:t xml:space="preserve">chmod 600</w:t>
+      </w:r>
+      <w:r>
+        <w:t xml:space="preserve"> dan dihapus setelah dipakai.</w:t>
       </w:r>
     </w:p>
     <w:p>
@@ -17130,6 +18329,19 @@
         <w:spacing w:after="80" w:line="276"/>
       </w:pPr>
       <w:r>
+        <w:t xml:space="preserve">Pakai akun service Nexus, bukan akun pribadi.</w:t>
+      </w:r>
+    </w:p>
+    <w:p>
+      <w:pPr>
+        <w:pStyle w:val="ListParagraph"/>
+        <w:numPr>
+          <w:ilvl w:val="0"/>
+          <w:numId w:val="3"/>
+        </w:numPr>
+        <w:spacing w:after="80" w:line="276"/>
+      </w:pPr>
+      <w:r>
         <w:t xml:space="preserve">Kubeconfig dibuat sementara per run; </w:t>
       </w:r>
       <w:r>
@@ -17162,11 +18374,11 @@
         <w:pStyle w:val="Heading1"/>
         <w:pageBreakBefore/>
       </w:pPr>
-      <w:bookmarkStart w:name="_Toc53" w:id="53"/>
+      <w:bookmarkStart w:name="_Toc54" w:id="54"/>
       <w:r>
         <w:t xml:space="preserve">Lampiran A. Ringkasan perintah</w:t>
       </w:r>
-      <w:bookmarkEnd w:id="53"/>
+      <w:bookmarkEnd w:id="54"/>
     </w:p>
     <w:tbl>
       <w:tblPr>

</xml_diff>